<commit_message>
chore: update docker-compose, templates, remove stale files
</commit_message>
<xml_diff>
--- a/template/Template_BBNT.docx
+++ b/template/Template_BBNT.docx
@@ -115,6 +115,7 @@
               </w:rPr>
               <w:t xml:space="preserve">{{ </w:t>
             </w:r>
+            <w:proofErr w:type="spellStart"/>
             <w:r>
               <w:rPr>
                 <w:rFonts w:ascii="Inter" w:eastAsia="Inter" w:hAnsi="Inter" w:cs="Inter"/>
@@ -125,6 +126,7 @@
               </w:rPr>
               <w:t>yyyy</w:t>
             </w:r>
+            <w:proofErr w:type="spellEnd"/>
             <w:r>
               <w:rPr>
                 <w:rFonts w:ascii="Inter" w:eastAsia="Inter" w:hAnsi="Inter" w:cs="Inter"/>
@@ -172,6 +174,7 @@
               </w:rPr>
               <w:t xml:space="preserve">{{ </w:t>
             </w:r>
+            <w:proofErr w:type="spellStart"/>
             <w:r>
               <w:rPr>
                 <w:rFonts w:ascii="Inter" w:eastAsia="Inter" w:hAnsi="Inter" w:cs="Inter"/>
@@ -182,6 +185,7 @@
               </w:rPr>
               <w:t>abbreviated_project</w:t>
             </w:r>
+            <w:proofErr w:type="spellEnd"/>
             <w:r>
               <w:rPr>
                 <w:rFonts w:ascii="Inter" w:eastAsia="Inter" w:hAnsi="Inter" w:cs="Inter"/>
@@ -192,6 +196,7 @@
               </w:rPr>
               <w:t xml:space="preserve"> }}{{ </w:t>
             </w:r>
+            <w:proofErr w:type="spellStart"/>
             <w:r>
               <w:rPr>
                 <w:rFonts w:ascii="Inter" w:eastAsia="Inter" w:hAnsi="Inter" w:cs="Inter"/>
@@ -202,6 +207,7 @@
               </w:rPr>
               <w:t>additional_information</w:t>
             </w:r>
+            <w:proofErr w:type="spellEnd"/>
             <w:r>
               <w:rPr>
                 <w:rFonts w:ascii="Inter" w:eastAsia="Inter" w:hAnsi="Inter" w:cs="Inter"/>
@@ -331,6 +337,7 @@
               </w:rPr>
               <w:t xml:space="preserve">{{ </w:t>
             </w:r>
+            <w:proofErr w:type="spellStart"/>
             <w:r>
               <w:rPr>
                 <w:rFonts w:ascii="Inter" w:eastAsia="Inter" w:hAnsi="Inter" w:cs="Inter"/>
@@ -341,6 +348,7 @@
               </w:rPr>
               <w:t>yyyy</w:t>
             </w:r>
+            <w:proofErr w:type="spellEnd"/>
             <w:r>
               <w:rPr>
                 <w:rFonts w:ascii="Inter" w:eastAsia="Inter" w:hAnsi="Inter" w:cs="Inter"/>
@@ -653,6 +661,7 @@
         </w:rPr>
         <w:t xml:space="preserve">{{ </w:t>
       </w:r>
+      <w:proofErr w:type="spellStart"/>
       <w:r>
         <w:rPr>
           <w:rFonts w:ascii="Inter" w:eastAsia="Inter" w:hAnsi="Inter" w:cs="Inter"/>
@@ -665,6 +674,7 @@
         </w:rPr>
         <w:t>yyyy</w:t>
       </w:r>
+      <w:proofErr w:type="spellEnd"/>
       <w:r>
         <w:rPr>
           <w:rFonts w:ascii="Inter" w:eastAsia="Inter" w:hAnsi="Inter" w:cs="Inter"/>
@@ -840,8 +850,39 @@
           <w:szCs w:val="24"/>
           <w:lang w:val="en-US"/>
         </w:rPr>
-        <w:t>ã số thuế</w:t>
-      </w:r>
+        <w:t xml:space="preserve">ã </w:t>
+      </w:r>
+      <w:proofErr w:type="spellStart"/>
+      <w:r>
+        <w:rPr>
+          <w:rFonts w:ascii="Inter" w:hAnsi="Inter" w:cs="Times New Roman"/>
+          <w:sz w:val="24"/>
+          <w:szCs w:val="24"/>
+          <w:lang w:val="en-US"/>
+        </w:rPr>
+        <w:t>số</w:t>
+      </w:r>
+      <w:proofErr w:type="spellEnd"/>
+      <w:r>
+        <w:rPr>
+          <w:rFonts w:ascii="Inter" w:hAnsi="Inter" w:cs="Times New Roman"/>
+          <w:sz w:val="24"/>
+          <w:szCs w:val="24"/>
+          <w:lang w:val="en-US"/>
+        </w:rPr>
+        <w:t xml:space="preserve"> </w:t>
+      </w:r>
+      <w:proofErr w:type="spellStart"/>
+      <w:r>
+        <w:rPr>
+          <w:rFonts w:ascii="Inter" w:hAnsi="Inter" w:cs="Times New Roman"/>
+          <w:sz w:val="24"/>
+          <w:szCs w:val="24"/>
+          <w:lang w:val="en-US"/>
+        </w:rPr>
+        <w:t>thuế</w:t>
+      </w:r>
+      <w:proofErr w:type="spellEnd"/>
       <w:r>
         <w:rPr>
           <w:rFonts w:ascii="Inter" w:hAnsi="Inter" w:cs="Times New Roman"/>
@@ -1625,6 +1666,7 @@
         </w:rPr>
         <w:t xml:space="preserve">{{ </w:t>
       </w:r>
+      <w:proofErr w:type="spellStart"/>
       <w:r>
         <w:rPr>
           <w:rFonts w:ascii="Inter" w:eastAsia="Inter" w:hAnsi="Inter" w:cs="Inter"/>
@@ -1635,6 +1677,7 @@
         </w:rPr>
         <w:t>yyyy</w:t>
       </w:r>
+      <w:proofErr w:type="spellEnd"/>
       <w:r>
         <w:rPr>
           <w:rFonts w:ascii="Inter" w:eastAsia="Inter" w:hAnsi="Inter" w:cs="Inter"/>
@@ -1664,6 +1707,7 @@
         </w:rPr>
         <w:t xml:space="preserve">{{ </w:t>
       </w:r>
+      <w:proofErr w:type="spellStart"/>
       <w:r>
         <w:rPr>
           <w:rFonts w:ascii="Inter" w:eastAsia="Inter" w:hAnsi="Inter" w:cs="Inter"/>
@@ -1674,6 +1718,7 @@
         </w:rPr>
         <w:t>abbreviated_project</w:t>
       </w:r>
+      <w:proofErr w:type="spellEnd"/>
       <w:r>
         <w:rPr>
           <w:rFonts w:ascii="Inter" w:eastAsia="Inter" w:hAnsi="Inter" w:cs="Inter"/>
@@ -1684,6 +1729,7 @@
         </w:rPr>
         <w:t xml:space="preserve"> }}{{ </w:t>
       </w:r>
+      <w:proofErr w:type="spellStart"/>
       <w:r>
         <w:rPr>
           <w:rFonts w:ascii="Inter" w:eastAsia="Inter" w:hAnsi="Inter" w:cs="Inter"/>
@@ -1694,6 +1740,7 @@
         </w:rPr>
         <w:t>additional_information</w:t>
       </w:r>
+      <w:proofErr w:type="spellEnd"/>
       <w:r>
         <w:rPr>
           <w:rFonts w:ascii="Inter" w:eastAsia="Inter" w:hAnsi="Inter" w:cs="Inter"/>
@@ -1805,6 +1852,7 @@
                 <w:szCs w:val="24"/>
               </w:rPr>
             </w:pPr>
+            <w:proofErr w:type="spellStart"/>
             <w:r>
               <w:rPr>
                 <w:rFonts w:ascii="Inter" w:eastAsia="Inter" w:hAnsi="Inter" w:cs="Inter"/>
@@ -1815,7 +1863,20 @@
                 <w:szCs w:val="24"/>
                 <w:lang w:val="en-US"/>
               </w:rPr>
-              <w:t>Nội dung</w:t>
+              <w:t>Nội</w:t>
+            </w:r>
+            <w:proofErr w:type="spellEnd"/>
+            <w:r>
+              <w:rPr>
+                <w:rFonts w:ascii="Inter" w:eastAsia="Inter" w:hAnsi="Inter" w:cs="Inter"/>
+                <w:b/>
+                <w:bCs/>
+                <w:color w:val="000000" w:themeColor="text1"/>
+                <w:sz w:val="24"/>
+                <w:szCs w:val="24"/>
+                <w:lang w:val="en-US"/>
+              </w:rPr>
+              <w:t xml:space="preserve"> dung</w:t>
             </w:r>
           </w:p>
         </w:tc>
@@ -2000,7 +2061,61 @@
                 <w:color w:val="000000" w:themeColor="text1"/>
                 <w:lang w:val="en-US"/>
               </w:rPr>
-              <w:t>(Ngày hoặc gói)</w:t>
+              <w:t>(</w:t>
+            </w:r>
+            <w:proofErr w:type="spellStart"/>
+            <w:r>
+              <w:rPr>
+                <w:rFonts w:ascii="Inter" w:eastAsia="Inter" w:hAnsi="Inter" w:cs="Inter"/>
+                <w:color w:val="000000" w:themeColor="text1"/>
+                <w:lang w:val="en-US"/>
+              </w:rPr>
+              <w:t>Ngày</w:t>
+            </w:r>
+            <w:proofErr w:type="spellEnd"/>
+            <w:r>
+              <w:rPr>
+                <w:rFonts w:ascii="Inter" w:eastAsia="Inter" w:hAnsi="Inter" w:cs="Inter"/>
+                <w:color w:val="000000" w:themeColor="text1"/>
+                <w:lang w:val="en-US"/>
+              </w:rPr>
+              <w:t xml:space="preserve"> </w:t>
+            </w:r>
+            <w:proofErr w:type="spellStart"/>
+            <w:r>
+              <w:rPr>
+                <w:rFonts w:ascii="Inter" w:eastAsia="Inter" w:hAnsi="Inter" w:cs="Inter"/>
+                <w:color w:val="000000" w:themeColor="text1"/>
+                <w:lang w:val="en-US"/>
+              </w:rPr>
+              <w:t>hoặc</w:t>
+            </w:r>
+            <w:proofErr w:type="spellEnd"/>
+            <w:r>
+              <w:rPr>
+                <w:rFonts w:ascii="Inter" w:eastAsia="Inter" w:hAnsi="Inter" w:cs="Inter"/>
+                <w:color w:val="000000" w:themeColor="text1"/>
+                <w:lang w:val="en-US"/>
+              </w:rPr>
+              <w:t xml:space="preserve"> </w:t>
+            </w:r>
+            <w:proofErr w:type="spellStart"/>
+            <w:r>
+              <w:rPr>
+                <w:rFonts w:ascii="Inter" w:eastAsia="Inter" w:hAnsi="Inter" w:cs="Inter"/>
+                <w:color w:val="000000" w:themeColor="text1"/>
+                <w:lang w:val="en-US"/>
+              </w:rPr>
+              <w:t>gói</w:t>
+            </w:r>
+            <w:proofErr w:type="spellEnd"/>
+            <w:r>
+              <w:rPr>
+                <w:rFonts w:ascii="Inter" w:eastAsia="Inter" w:hAnsi="Inter" w:cs="Inter"/>
+                <w:color w:val="000000" w:themeColor="text1"/>
+                <w:lang w:val="en-US"/>
+              </w:rPr>
+              <w:t>)</w:t>
             </w:r>
           </w:p>
         </w:tc>
@@ -2034,7 +2149,79 @@
                 <w:color w:val="000000" w:themeColor="text1"/>
                 <w:lang w:val="en-US"/>
               </w:rPr>
-              <w:t>(đồng/ngày hoặc gói)</w:t>
+              <w:t>(</w:t>
+            </w:r>
+            <w:proofErr w:type="spellStart"/>
+            <w:r>
+              <w:rPr>
+                <w:rFonts w:ascii="Inter" w:eastAsia="Inter" w:hAnsi="Inter" w:cs="Inter"/>
+                <w:color w:val="000000" w:themeColor="text1"/>
+                <w:lang w:val="en-US"/>
+              </w:rPr>
+              <w:t>đồng</w:t>
+            </w:r>
+            <w:proofErr w:type="spellEnd"/>
+            <w:r>
+              <w:rPr>
+                <w:rFonts w:ascii="Inter" w:eastAsia="Inter" w:hAnsi="Inter" w:cs="Inter"/>
+                <w:color w:val="000000" w:themeColor="text1"/>
+                <w:lang w:val="en-US"/>
+              </w:rPr>
+              <w:t>/</w:t>
+            </w:r>
+            <w:proofErr w:type="spellStart"/>
+            <w:r>
+              <w:rPr>
+                <w:rFonts w:ascii="Inter" w:eastAsia="Inter" w:hAnsi="Inter" w:cs="Inter"/>
+                <w:color w:val="000000" w:themeColor="text1"/>
+                <w:lang w:val="en-US"/>
+              </w:rPr>
+              <w:t>ngày</w:t>
+            </w:r>
+            <w:proofErr w:type="spellEnd"/>
+            <w:r>
+              <w:rPr>
+                <w:rFonts w:ascii="Inter" w:eastAsia="Inter" w:hAnsi="Inter" w:cs="Inter"/>
+                <w:color w:val="000000" w:themeColor="text1"/>
+                <w:lang w:val="en-US"/>
+              </w:rPr>
+              <w:t xml:space="preserve"> </w:t>
+            </w:r>
+            <w:proofErr w:type="spellStart"/>
+            <w:r>
+              <w:rPr>
+                <w:rFonts w:ascii="Inter" w:eastAsia="Inter" w:hAnsi="Inter" w:cs="Inter"/>
+                <w:color w:val="000000" w:themeColor="text1"/>
+                <w:lang w:val="en-US"/>
+              </w:rPr>
+              <w:t>hoặc</w:t>
+            </w:r>
+            <w:proofErr w:type="spellEnd"/>
+            <w:r>
+              <w:rPr>
+                <w:rFonts w:ascii="Inter" w:eastAsia="Inter" w:hAnsi="Inter" w:cs="Inter"/>
+                <w:color w:val="000000" w:themeColor="text1"/>
+                <w:lang w:val="en-US"/>
+              </w:rPr>
+              <w:t xml:space="preserve"> </w:t>
+            </w:r>
+            <w:proofErr w:type="spellStart"/>
+            <w:r>
+              <w:rPr>
+                <w:rFonts w:ascii="Inter" w:eastAsia="Inter" w:hAnsi="Inter" w:cs="Inter"/>
+                <w:color w:val="000000" w:themeColor="text1"/>
+                <w:lang w:val="en-US"/>
+              </w:rPr>
+              <w:t>gói</w:t>
+            </w:r>
+            <w:proofErr w:type="spellEnd"/>
+            <w:r>
+              <w:rPr>
+                <w:rFonts w:ascii="Inter" w:eastAsia="Inter" w:hAnsi="Inter" w:cs="Inter"/>
+                <w:color w:val="000000" w:themeColor="text1"/>
+                <w:lang w:val="en-US"/>
+              </w:rPr>
+              <w:t>)</w:t>
             </w:r>
           </w:p>
         </w:tc>
@@ -2068,7 +2255,25 @@
                 <w:color w:val="000000" w:themeColor="text1"/>
                 <w:lang w:val="en-US"/>
               </w:rPr>
-              <w:t>(Đồng)</w:t>
+              <w:t>(</w:t>
+            </w:r>
+            <w:proofErr w:type="spellStart"/>
+            <w:r>
+              <w:rPr>
+                <w:rFonts w:ascii="Inter" w:eastAsia="Inter" w:hAnsi="Inter" w:cs="Inter"/>
+                <w:color w:val="000000" w:themeColor="text1"/>
+                <w:lang w:val="en-US"/>
+              </w:rPr>
+              <w:t>Đồng</w:t>
+            </w:r>
+            <w:proofErr w:type="spellEnd"/>
+            <w:r>
+              <w:rPr>
+                <w:rFonts w:ascii="Inter" w:eastAsia="Inter" w:hAnsi="Inter" w:cs="Inter"/>
+                <w:color w:val="000000" w:themeColor="text1"/>
+                <w:lang w:val="en-US"/>
+              </w:rPr>
+              <w:t>)</w:t>
             </w:r>
           </w:p>
         </w:tc>
@@ -2245,6 +2450,7 @@
                 <w:szCs w:val="24"/>
               </w:rPr>
             </w:pPr>
+            <w:proofErr w:type="gramStart"/>
             <w:r>
               <w:rPr>
                 <w:rFonts w:ascii="Inter" w:eastAsia="Inter" w:hAnsi="Inter" w:cs="Inter"/>
@@ -2276,7 +2482,18 @@
                 <w:sz w:val="24"/>
                 <w:szCs w:val="24"/>
               </w:rPr>
-              <w:t xml:space="preserve"> activity.working_days }}</w:t>
+              <w:t xml:space="preserve"> activity</w:t>
+            </w:r>
+            <w:proofErr w:type="gramEnd"/>
+            <w:r>
+              <w:rPr>
+                <w:rFonts w:ascii="Inter" w:eastAsia="Inter" w:hAnsi="Inter" w:cs="Inter"/>
+                <w:i/>
+                <w:iCs/>
+                <w:sz w:val="24"/>
+                <w:szCs w:val="24"/>
+              </w:rPr>
+              <w:t>.working_days }}</w:t>
             </w:r>
           </w:p>
         </w:tc>
@@ -2461,6 +2678,7 @@
                 <w:szCs w:val="24"/>
               </w:rPr>
             </w:pPr>
+            <w:proofErr w:type="spellStart"/>
             <w:r>
               <w:rPr>
                 <w:rFonts w:ascii="Inter" w:eastAsia="Inter" w:hAnsi="Inter" w:cs="Inter"/>
@@ -2471,8 +2689,35 @@
                 <w:szCs w:val="24"/>
                 <w:lang w:val="en-US"/>
               </w:rPr>
-              <w:t>Tổng cộng</w:t>
-            </w:r>
+              <w:t>Tổng</w:t>
+            </w:r>
+            <w:proofErr w:type="spellEnd"/>
+            <w:r>
+              <w:rPr>
+                <w:rFonts w:ascii="Inter" w:eastAsia="Inter" w:hAnsi="Inter" w:cs="Inter"/>
+                <w:b/>
+                <w:bCs/>
+                <w:color w:val="000000" w:themeColor="text1"/>
+                <w:sz w:val="24"/>
+                <w:szCs w:val="24"/>
+                <w:lang w:val="en-US"/>
+              </w:rPr>
+              <w:t xml:space="preserve"> </w:t>
+            </w:r>
+            <w:proofErr w:type="spellStart"/>
+            <w:r>
+              <w:rPr>
+                <w:rFonts w:ascii="Inter" w:eastAsia="Inter" w:hAnsi="Inter" w:cs="Inter"/>
+                <w:b/>
+                <w:bCs/>
+                <w:color w:val="000000" w:themeColor="text1"/>
+                <w:sz w:val="24"/>
+                <w:szCs w:val="24"/>
+                <w:lang w:val="en-US"/>
+              </w:rPr>
+              <w:t>cộng</w:t>
+            </w:r>
+            <w:proofErr w:type="spellEnd"/>
           </w:p>
         </w:tc>
         <w:tc>
@@ -2545,6 +2790,7 @@
                 <w:szCs w:val="24"/>
               </w:rPr>
             </w:pPr>
+            <w:proofErr w:type="spellStart"/>
             <w:r>
               <w:rPr>
                 <w:rFonts w:ascii="Inter" w:eastAsia="Inter" w:hAnsi="Inter" w:cs="Inter"/>
@@ -2555,8 +2801,61 @@
                 <w:szCs w:val="24"/>
                 <w:lang w:val="en-US"/>
               </w:rPr>
-              <w:t>Thuế TNCN 10% giữ lại</w:t>
-            </w:r>
+              <w:t>Thuế</w:t>
+            </w:r>
+            <w:proofErr w:type="spellEnd"/>
+            <w:r>
+              <w:rPr>
+                <w:rFonts w:ascii="Inter" w:eastAsia="Inter" w:hAnsi="Inter" w:cs="Inter"/>
+                <w:b/>
+                <w:bCs/>
+                <w:color w:val="000000" w:themeColor="text1"/>
+                <w:sz w:val="24"/>
+                <w:szCs w:val="24"/>
+                <w:lang w:val="en-US"/>
+              </w:rPr>
+              <w:t xml:space="preserve"> TNCN 10% </w:t>
+            </w:r>
+            <w:proofErr w:type="spellStart"/>
+            <w:r>
+              <w:rPr>
+                <w:rFonts w:ascii="Inter" w:eastAsia="Inter" w:hAnsi="Inter" w:cs="Inter"/>
+                <w:b/>
+                <w:bCs/>
+                <w:color w:val="000000" w:themeColor="text1"/>
+                <w:sz w:val="24"/>
+                <w:szCs w:val="24"/>
+                <w:lang w:val="en-US"/>
+              </w:rPr>
+              <w:t>giữ</w:t>
+            </w:r>
+            <w:proofErr w:type="spellEnd"/>
+            <w:r>
+              <w:rPr>
+                <w:rFonts w:ascii="Inter" w:eastAsia="Inter" w:hAnsi="Inter" w:cs="Inter"/>
+                <w:b/>
+                <w:bCs/>
+                <w:color w:val="000000" w:themeColor="text1"/>
+                <w:sz w:val="24"/>
+                <w:szCs w:val="24"/>
+                <w:lang w:val="en-US"/>
+              </w:rPr>
+              <w:t xml:space="preserve"> </w:t>
+            </w:r>
+            <w:proofErr w:type="spellStart"/>
+            <w:r>
+              <w:rPr>
+                <w:rFonts w:ascii="Inter" w:eastAsia="Inter" w:hAnsi="Inter" w:cs="Inter"/>
+                <w:b/>
+                <w:bCs/>
+                <w:color w:val="000000" w:themeColor="text1"/>
+                <w:sz w:val="24"/>
+                <w:szCs w:val="24"/>
+                <w:lang w:val="en-US"/>
+              </w:rPr>
+              <w:t>lại</w:t>
+            </w:r>
+            <w:proofErr w:type="spellEnd"/>
           </w:p>
         </w:tc>
         <w:tc>
@@ -2630,6 +2929,7 @@
                 <w:szCs w:val="24"/>
               </w:rPr>
             </w:pPr>
+            <w:proofErr w:type="spellStart"/>
             <w:r>
               <w:rPr>
                 <w:rFonts w:ascii="Inter" w:eastAsia="Inter" w:hAnsi="Inter" w:cs="Inter"/>
@@ -2640,8 +2940,165 @@
                 <w:szCs w:val="24"/>
                 <w:lang w:val="en-US"/>
               </w:rPr>
-              <w:t>Tổng tiền thanh toán cho chuyên gia</w:t>
-            </w:r>
+              <w:t>Tổng</w:t>
+            </w:r>
+            <w:proofErr w:type="spellEnd"/>
+            <w:r>
+              <w:rPr>
+                <w:rFonts w:ascii="Inter" w:eastAsia="Inter" w:hAnsi="Inter" w:cs="Inter"/>
+                <w:b/>
+                <w:bCs/>
+                <w:color w:val="000000" w:themeColor="text1"/>
+                <w:sz w:val="24"/>
+                <w:szCs w:val="24"/>
+                <w:lang w:val="en-US"/>
+              </w:rPr>
+              <w:t xml:space="preserve"> </w:t>
+            </w:r>
+            <w:proofErr w:type="spellStart"/>
+            <w:r>
+              <w:rPr>
+                <w:rFonts w:ascii="Inter" w:eastAsia="Inter" w:hAnsi="Inter" w:cs="Inter"/>
+                <w:b/>
+                <w:bCs/>
+                <w:color w:val="000000" w:themeColor="text1"/>
+                <w:sz w:val="24"/>
+                <w:szCs w:val="24"/>
+                <w:lang w:val="en-US"/>
+              </w:rPr>
+              <w:t>tiền</w:t>
+            </w:r>
+            <w:proofErr w:type="spellEnd"/>
+            <w:r>
+              <w:rPr>
+                <w:rFonts w:ascii="Inter" w:eastAsia="Inter" w:hAnsi="Inter" w:cs="Inter"/>
+                <w:b/>
+                <w:bCs/>
+                <w:color w:val="000000" w:themeColor="text1"/>
+                <w:sz w:val="24"/>
+                <w:szCs w:val="24"/>
+                <w:lang w:val="en-US"/>
+              </w:rPr>
+              <w:t xml:space="preserve"> </w:t>
+            </w:r>
+            <w:proofErr w:type="spellStart"/>
+            <w:r>
+              <w:rPr>
+                <w:rFonts w:ascii="Inter" w:eastAsia="Inter" w:hAnsi="Inter" w:cs="Inter"/>
+                <w:b/>
+                <w:bCs/>
+                <w:color w:val="000000" w:themeColor="text1"/>
+                <w:sz w:val="24"/>
+                <w:szCs w:val="24"/>
+                <w:lang w:val="en-US"/>
+              </w:rPr>
+              <w:t>thanh</w:t>
+            </w:r>
+            <w:proofErr w:type="spellEnd"/>
+            <w:r>
+              <w:rPr>
+                <w:rFonts w:ascii="Inter" w:eastAsia="Inter" w:hAnsi="Inter" w:cs="Inter"/>
+                <w:b/>
+                <w:bCs/>
+                <w:color w:val="000000" w:themeColor="text1"/>
+                <w:sz w:val="24"/>
+                <w:szCs w:val="24"/>
+                <w:lang w:val="en-US"/>
+              </w:rPr>
+              <w:t xml:space="preserve"> </w:t>
+            </w:r>
+            <w:proofErr w:type="spellStart"/>
+            <w:r>
+              <w:rPr>
+                <w:rFonts w:ascii="Inter" w:eastAsia="Inter" w:hAnsi="Inter" w:cs="Inter"/>
+                <w:b/>
+                <w:bCs/>
+                <w:color w:val="000000" w:themeColor="text1"/>
+                <w:sz w:val="24"/>
+                <w:szCs w:val="24"/>
+                <w:lang w:val="en-US"/>
+              </w:rPr>
+              <w:t>toán</w:t>
+            </w:r>
+            <w:proofErr w:type="spellEnd"/>
+            <w:r>
+              <w:rPr>
+                <w:rFonts w:ascii="Inter" w:eastAsia="Inter" w:hAnsi="Inter" w:cs="Inter"/>
+                <w:b/>
+                <w:bCs/>
+                <w:color w:val="000000" w:themeColor="text1"/>
+                <w:sz w:val="24"/>
+                <w:szCs w:val="24"/>
+                <w:lang w:val="en-US"/>
+              </w:rPr>
+              <w:t xml:space="preserve"> </w:t>
+            </w:r>
+            <w:proofErr w:type="spellStart"/>
+            <w:r>
+              <w:rPr>
+                <w:rFonts w:ascii="Inter" w:eastAsia="Inter" w:hAnsi="Inter" w:cs="Inter"/>
+                <w:b/>
+                <w:bCs/>
+                <w:color w:val="000000" w:themeColor="text1"/>
+                <w:sz w:val="24"/>
+                <w:szCs w:val="24"/>
+                <w:lang w:val="en-US"/>
+              </w:rPr>
+              <w:t>cho</w:t>
+            </w:r>
+            <w:proofErr w:type="spellEnd"/>
+            <w:r>
+              <w:rPr>
+                <w:rFonts w:ascii="Inter" w:eastAsia="Inter" w:hAnsi="Inter" w:cs="Inter"/>
+                <w:b/>
+                <w:bCs/>
+                <w:color w:val="000000" w:themeColor="text1"/>
+                <w:sz w:val="24"/>
+                <w:szCs w:val="24"/>
+                <w:lang w:val="en-US"/>
+              </w:rPr>
+              <w:t xml:space="preserve"> </w:t>
+            </w:r>
+            <w:proofErr w:type="spellStart"/>
+            <w:r>
+              <w:rPr>
+                <w:rFonts w:ascii="Inter" w:eastAsia="Inter" w:hAnsi="Inter" w:cs="Inter"/>
+                <w:b/>
+                <w:bCs/>
+                <w:color w:val="000000" w:themeColor="text1"/>
+                <w:sz w:val="24"/>
+                <w:szCs w:val="24"/>
+                <w:lang w:val="en-US"/>
+              </w:rPr>
+              <w:t>chuyên</w:t>
+            </w:r>
+            <w:proofErr w:type="spellEnd"/>
+            <w:r>
+              <w:rPr>
+                <w:rFonts w:ascii="Inter" w:eastAsia="Inter" w:hAnsi="Inter" w:cs="Inter"/>
+                <w:b/>
+                <w:bCs/>
+                <w:color w:val="000000" w:themeColor="text1"/>
+                <w:sz w:val="24"/>
+                <w:szCs w:val="24"/>
+                <w:lang w:val="en-US"/>
+              </w:rPr>
+              <w:t xml:space="preserve"> </w:t>
+            </w:r>
+            <w:proofErr w:type="spellStart"/>
+            <w:r>
+              <w:rPr>
+                <w:rFonts w:ascii="Inter" w:eastAsia="Inter" w:hAnsi="Inter" w:cs="Inter"/>
+                <w:b/>
+                <w:bCs/>
+                <w:color w:val="000000" w:themeColor="text1"/>
+                <w:sz w:val="24"/>
+                <w:szCs w:val="24"/>
+                <w:lang w:val="en-US"/>
+              </w:rPr>
+              <w:t>gia</w:t>
+            </w:r>
+            <w:proofErr w:type="spellEnd"/>
           </w:p>
         </w:tc>
         <w:tc>
@@ -2724,6 +3181,7 @@
               </w:rPr>
               <w:t xml:space="preserve">     </w:t>
             </w:r>
+            <w:proofErr w:type="spellStart"/>
             <w:r>
               <w:rPr>
                 <w:rFonts w:ascii="Inter" w:eastAsia="Inter" w:hAnsi="Inter" w:cs="Inter"/>
@@ -2734,32 +3192,9 @@
                 <w:color w:val="000000" w:themeColor="text1"/>
                 <w:lang w:val="en-US"/>
               </w:rPr>
-              <w:t xml:space="preserve">Bằng chữ: </w:t>
-            </w:r>
-            <w:r>
-              <w:rPr>
-                <w:rFonts w:ascii="Inter" w:eastAsia="Inter" w:hAnsi="Inter" w:cs="Inter"/>
-                <w:i/>
-                <w:iCs/>
-              </w:rPr>
-              <w:t>{{</w:t>
-            </w:r>
-            <w:r>
-              <w:rPr>
-                <w:rFonts w:ascii="Inter" w:eastAsia="Inter" w:hAnsi="Inter" w:cs="Inter"/>
-                <w:i/>
-                <w:iCs/>
-              </w:rPr>
-              <w:t xml:space="preserve"> text_amount </w:t>
-            </w:r>
-            <w:r>
-              <w:rPr>
-                <w:rFonts w:ascii="Inter" w:eastAsia="Inter" w:hAnsi="Inter" w:cs="Inter"/>
-                <w:i/>
-                <w:iCs/>
-              </w:rPr>
-              <w:t>}}</w:t>
-            </w:r>
+              <w:t>Bằng</w:t>
+            </w:r>
+            <w:proofErr w:type="spellEnd"/>
             <w:r>
               <w:rPr>
                 <w:rFonts w:ascii="Inter" w:eastAsia="Inter" w:hAnsi="Inter" w:cs="Inter"/>
@@ -2767,8 +3202,80 @@
                 <w:bCs/>
                 <w:i/>
                 <w:iCs/>
-              </w:rPr>
-              <w:t xml:space="preserve">                                                                                                                             </w:t>
+                <w:color w:val="000000" w:themeColor="text1"/>
+                <w:lang w:val="en-US"/>
+              </w:rPr>
+              <w:t xml:space="preserve"> </w:t>
+            </w:r>
+            <w:proofErr w:type="spellStart"/>
+            <w:r>
+              <w:rPr>
+                <w:rFonts w:ascii="Inter" w:eastAsia="Inter" w:hAnsi="Inter" w:cs="Inter"/>
+                <w:b/>
+                <w:bCs/>
+                <w:i/>
+                <w:iCs/>
+                <w:color w:val="000000" w:themeColor="text1"/>
+                <w:lang w:val="en-US"/>
+              </w:rPr>
+              <w:t>chữ</w:t>
+            </w:r>
+            <w:proofErr w:type="spellEnd"/>
+            <w:r>
+              <w:rPr>
+                <w:rFonts w:ascii="Inter" w:eastAsia="Inter" w:hAnsi="Inter" w:cs="Inter"/>
+                <w:b/>
+                <w:bCs/>
+                <w:i/>
+                <w:iCs/>
+                <w:color w:val="000000" w:themeColor="text1"/>
+                <w:lang w:val="en-US"/>
+              </w:rPr>
+              <w:t xml:space="preserve">: </w:t>
+            </w:r>
+            <w:proofErr w:type="gramStart"/>
+            <w:r>
+              <w:rPr>
+                <w:rFonts w:ascii="Inter" w:eastAsia="Inter" w:hAnsi="Inter" w:cs="Inter"/>
+                <w:b/>
+                <w:bCs/>
+                <w:i/>
+                <w:iCs/>
+              </w:rPr>
+              <w:t>{{ text</w:t>
+            </w:r>
+            <w:proofErr w:type="gramEnd"/>
+            <w:r>
+              <w:rPr>
+                <w:rFonts w:ascii="Inter" w:eastAsia="Inter" w:hAnsi="Inter" w:cs="Inter"/>
+                <w:b/>
+                <w:bCs/>
+                <w:i/>
+                <w:iCs/>
+              </w:rPr>
+              <w:t>_</w:t>
+            </w:r>
+            <w:proofErr w:type="gramStart"/>
+            <w:r>
+              <w:rPr>
+                <w:rFonts w:ascii="Inter" w:eastAsia="Inter" w:hAnsi="Inter" w:cs="Inter"/>
+                <w:b/>
+                <w:bCs/>
+                <w:i/>
+                <w:iCs/>
+              </w:rPr>
+              <w:t>amount }</w:t>
+            </w:r>
+            <w:proofErr w:type="gramEnd"/>
+            <w:r>
+              <w:rPr>
+                <w:rFonts w:ascii="Inter" w:eastAsia="Inter" w:hAnsi="Inter" w:cs="Inter"/>
+                <w:b/>
+                <w:bCs/>
+                <w:i/>
+                <w:iCs/>
+              </w:rPr>
+              <w:t xml:space="preserve">}                                                                                                                             </w:t>
             </w:r>
             <w:r>
               <w:rPr>
@@ -2797,6 +3304,7 @@
           <w:szCs w:val="24"/>
         </w:rPr>
       </w:pPr>
+      <w:proofErr w:type="spellStart"/>
       <w:r>
         <w:rPr>
           <w:rFonts w:ascii="Inter" w:eastAsia="Times New Roman" w:hAnsi="Inter" w:cs="Times New Roman"/>
@@ -2805,8 +3313,416 @@
           <w:szCs w:val="24"/>
           <w:lang w:val="en-US"/>
         </w:rPr>
-        <w:t xml:space="preserve">Việc thanh toán sẽ được thực hiện theo đúng Điều 3: Các điều khoản về tài chính của hợp đồng số </w:t>
-      </w:r>
+        <w:t>Việc</w:t>
+      </w:r>
+      <w:proofErr w:type="spellEnd"/>
+      <w:r>
+        <w:rPr>
+          <w:rFonts w:ascii="Inter" w:eastAsia="Times New Roman" w:hAnsi="Inter" w:cs="Times New Roman"/>
+          <w:color w:val="000000" w:themeColor="text1"/>
+          <w:sz w:val="24"/>
+          <w:szCs w:val="24"/>
+          <w:lang w:val="en-US"/>
+        </w:rPr>
+        <w:t xml:space="preserve"> </w:t>
+      </w:r>
+      <w:proofErr w:type="spellStart"/>
+      <w:r>
+        <w:rPr>
+          <w:rFonts w:ascii="Inter" w:eastAsia="Times New Roman" w:hAnsi="Inter" w:cs="Times New Roman"/>
+          <w:color w:val="000000" w:themeColor="text1"/>
+          <w:sz w:val="24"/>
+          <w:szCs w:val="24"/>
+          <w:lang w:val="en-US"/>
+        </w:rPr>
+        <w:t>thanh</w:t>
+      </w:r>
+      <w:proofErr w:type="spellEnd"/>
+      <w:r>
+        <w:rPr>
+          <w:rFonts w:ascii="Inter" w:eastAsia="Times New Roman" w:hAnsi="Inter" w:cs="Times New Roman"/>
+          <w:color w:val="000000" w:themeColor="text1"/>
+          <w:sz w:val="24"/>
+          <w:szCs w:val="24"/>
+          <w:lang w:val="en-US"/>
+        </w:rPr>
+        <w:t xml:space="preserve"> </w:t>
+      </w:r>
+      <w:proofErr w:type="spellStart"/>
+      <w:r>
+        <w:rPr>
+          <w:rFonts w:ascii="Inter" w:eastAsia="Times New Roman" w:hAnsi="Inter" w:cs="Times New Roman"/>
+          <w:color w:val="000000" w:themeColor="text1"/>
+          <w:sz w:val="24"/>
+          <w:szCs w:val="24"/>
+          <w:lang w:val="en-US"/>
+        </w:rPr>
+        <w:t>toán</w:t>
+      </w:r>
+      <w:proofErr w:type="spellEnd"/>
+      <w:r>
+        <w:rPr>
+          <w:rFonts w:ascii="Inter" w:eastAsia="Times New Roman" w:hAnsi="Inter" w:cs="Times New Roman"/>
+          <w:color w:val="000000" w:themeColor="text1"/>
+          <w:sz w:val="24"/>
+          <w:szCs w:val="24"/>
+          <w:lang w:val="en-US"/>
+        </w:rPr>
+        <w:t xml:space="preserve"> </w:t>
+      </w:r>
+      <w:proofErr w:type="spellStart"/>
+      <w:r>
+        <w:rPr>
+          <w:rFonts w:ascii="Inter" w:eastAsia="Times New Roman" w:hAnsi="Inter" w:cs="Times New Roman"/>
+          <w:color w:val="000000" w:themeColor="text1"/>
+          <w:sz w:val="24"/>
+          <w:szCs w:val="24"/>
+          <w:lang w:val="en-US"/>
+        </w:rPr>
+        <w:t>sẽ</w:t>
+      </w:r>
+      <w:proofErr w:type="spellEnd"/>
+      <w:r>
+        <w:rPr>
+          <w:rFonts w:ascii="Inter" w:eastAsia="Times New Roman" w:hAnsi="Inter" w:cs="Times New Roman"/>
+          <w:color w:val="000000" w:themeColor="text1"/>
+          <w:sz w:val="24"/>
+          <w:szCs w:val="24"/>
+          <w:lang w:val="en-US"/>
+        </w:rPr>
+        <w:t xml:space="preserve"> </w:t>
+      </w:r>
+      <w:proofErr w:type="spellStart"/>
+      <w:r>
+        <w:rPr>
+          <w:rFonts w:ascii="Inter" w:eastAsia="Times New Roman" w:hAnsi="Inter" w:cs="Times New Roman"/>
+          <w:color w:val="000000" w:themeColor="text1"/>
+          <w:sz w:val="24"/>
+          <w:szCs w:val="24"/>
+          <w:lang w:val="en-US"/>
+        </w:rPr>
+        <w:t>được</w:t>
+      </w:r>
+      <w:proofErr w:type="spellEnd"/>
+      <w:r>
+        <w:rPr>
+          <w:rFonts w:ascii="Inter" w:eastAsia="Times New Roman" w:hAnsi="Inter" w:cs="Times New Roman"/>
+          <w:color w:val="000000" w:themeColor="text1"/>
+          <w:sz w:val="24"/>
+          <w:szCs w:val="24"/>
+          <w:lang w:val="en-US"/>
+        </w:rPr>
+        <w:t xml:space="preserve"> </w:t>
+      </w:r>
+      <w:proofErr w:type="spellStart"/>
+      <w:r>
+        <w:rPr>
+          <w:rFonts w:ascii="Inter" w:eastAsia="Times New Roman" w:hAnsi="Inter" w:cs="Times New Roman"/>
+          <w:color w:val="000000" w:themeColor="text1"/>
+          <w:sz w:val="24"/>
+          <w:szCs w:val="24"/>
+          <w:lang w:val="en-US"/>
+        </w:rPr>
+        <w:t>thực</w:t>
+      </w:r>
+      <w:proofErr w:type="spellEnd"/>
+      <w:r>
+        <w:rPr>
+          <w:rFonts w:ascii="Inter" w:eastAsia="Times New Roman" w:hAnsi="Inter" w:cs="Times New Roman"/>
+          <w:color w:val="000000" w:themeColor="text1"/>
+          <w:sz w:val="24"/>
+          <w:szCs w:val="24"/>
+          <w:lang w:val="en-US"/>
+        </w:rPr>
+        <w:t xml:space="preserve"> </w:t>
+      </w:r>
+      <w:proofErr w:type="spellStart"/>
+      <w:r>
+        <w:rPr>
+          <w:rFonts w:ascii="Inter" w:eastAsia="Times New Roman" w:hAnsi="Inter" w:cs="Times New Roman"/>
+          <w:color w:val="000000" w:themeColor="text1"/>
+          <w:sz w:val="24"/>
+          <w:szCs w:val="24"/>
+          <w:lang w:val="en-US"/>
+        </w:rPr>
+        <w:t>hiện</w:t>
+      </w:r>
+      <w:proofErr w:type="spellEnd"/>
+      <w:r>
+        <w:rPr>
+          <w:rFonts w:ascii="Inter" w:eastAsia="Times New Roman" w:hAnsi="Inter" w:cs="Times New Roman"/>
+          <w:color w:val="000000" w:themeColor="text1"/>
+          <w:sz w:val="24"/>
+          <w:szCs w:val="24"/>
+          <w:lang w:val="en-US"/>
+        </w:rPr>
+        <w:t xml:space="preserve"> </w:t>
+      </w:r>
+      <w:proofErr w:type="spellStart"/>
+      <w:r>
+        <w:rPr>
+          <w:rFonts w:ascii="Inter" w:eastAsia="Times New Roman" w:hAnsi="Inter" w:cs="Times New Roman"/>
+          <w:color w:val="000000" w:themeColor="text1"/>
+          <w:sz w:val="24"/>
+          <w:szCs w:val="24"/>
+          <w:lang w:val="en-US"/>
+        </w:rPr>
+        <w:t>theo</w:t>
+      </w:r>
+      <w:proofErr w:type="spellEnd"/>
+      <w:r>
+        <w:rPr>
+          <w:rFonts w:ascii="Inter" w:eastAsia="Times New Roman" w:hAnsi="Inter" w:cs="Times New Roman"/>
+          <w:color w:val="000000" w:themeColor="text1"/>
+          <w:sz w:val="24"/>
+          <w:szCs w:val="24"/>
+          <w:lang w:val="en-US"/>
+        </w:rPr>
+        <w:t xml:space="preserve"> </w:t>
+      </w:r>
+      <w:proofErr w:type="spellStart"/>
+      <w:r>
+        <w:rPr>
+          <w:rFonts w:ascii="Inter" w:eastAsia="Times New Roman" w:hAnsi="Inter" w:cs="Times New Roman"/>
+          <w:color w:val="000000" w:themeColor="text1"/>
+          <w:sz w:val="24"/>
+          <w:szCs w:val="24"/>
+          <w:lang w:val="en-US"/>
+        </w:rPr>
+        <w:t>đúng</w:t>
+      </w:r>
+      <w:proofErr w:type="spellEnd"/>
+      <w:r>
+        <w:rPr>
+          <w:rFonts w:ascii="Inter" w:eastAsia="Times New Roman" w:hAnsi="Inter" w:cs="Times New Roman"/>
+          <w:color w:val="000000" w:themeColor="text1"/>
+          <w:sz w:val="24"/>
+          <w:szCs w:val="24"/>
+          <w:lang w:val="en-US"/>
+        </w:rPr>
+        <w:t xml:space="preserve"> </w:t>
+      </w:r>
+      <w:proofErr w:type="spellStart"/>
+      <w:r>
+        <w:rPr>
+          <w:rFonts w:ascii="Inter" w:eastAsia="Times New Roman" w:hAnsi="Inter" w:cs="Times New Roman"/>
+          <w:color w:val="000000" w:themeColor="text1"/>
+          <w:sz w:val="24"/>
+          <w:szCs w:val="24"/>
+          <w:lang w:val="en-US"/>
+        </w:rPr>
+        <w:t>Điều</w:t>
+      </w:r>
+      <w:proofErr w:type="spellEnd"/>
+      <w:r>
+        <w:rPr>
+          <w:rFonts w:ascii="Inter" w:eastAsia="Times New Roman" w:hAnsi="Inter" w:cs="Times New Roman"/>
+          <w:color w:val="000000" w:themeColor="text1"/>
+          <w:sz w:val="24"/>
+          <w:szCs w:val="24"/>
+          <w:lang w:val="en-US"/>
+        </w:rPr>
+        <w:t xml:space="preserve"> 3: Các </w:t>
+      </w:r>
+      <w:proofErr w:type="spellStart"/>
+      <w:r>
+        <w:rPr>
+          <w:rFonts w:ascii="Inter" w:eastAsia="Times New Roman" w:hAnsi="Inter" w:cs="Times New Roman"/>
+          <w:color w:val="000000" w:themeColor="text1"/>
+          <w:sz w:val="24"/>
+          <w:szCs w:val="24"/>
+          <w:lang w:val="en-US"/>
+        </w:rPr>
+        <w:t>điều</w:t>
+      </w:r>
+      <w:proofErr w:type="spellEnd"/>
+      <w:r>
+        <w:rPr>
+          <w:rFonts w:ascii="Inter" w:eastAsia="Times New Roman" w:hAnsi="Inter" w:cs="Times New Roman"/>
+          <w:color w:val="000000" w:themeColor="text1"/>
+          <w:sz w:val="24"/>
+          <w:szCs w:val="24"/>
+          <w:lang w:val="en-US"/>
+        </w:rPr>
+        <w:t xml:space="preserve"> </w:t>
+      </w:r>
+      <w:proofErr w:type="spellStart"/>
+      <w:r>
+        <w:rPr>
+          <w:rFonts w:ascii="Inter" w:eastAsia="Times New Roman" w:hAnsi="Inter" w:cs="Times New Roman"/>
+          <w:color w:val="000000" w:themeColor="text1"/>
+          <w:sz w:val="24"/>
+          <w:szCs w:val="24"/>
+          <w:lang w:val="en-US"/>
+        </w:rPr>
+        <w:t>khoản</w:t>
+      </w:r>
+      <w:proofErr w:type="spellEnd"/>
+      <w:r>
+        <w:rPr>
+          <w:rFonts w:ascii="Inter" w:eastAsia="Times New Roman" w:hAnsi="Inter" w:cs="Times New Roman"/>
+          <w:color w:val="000000" w:themeColor="text1"/>
+          <w:sz w:val="24"/>
+          <w:szCs w:val="24"/>
+          <w:lang w:val="en-US"/>
+        </w:rPr>
+        <w:t xml:space="preserve"> </w:t>
+      </w:r>
+      <w:proofErr w:type="spellStart"/>
+      <w:r>
+        <w:rPr>
+          <w:rFonts w:ascii="Inter" w:eastAsia="Times New Roman" w:hAnsi="Inter" w:cs="Times New Roman"/>
+          <w:color w:val="000000" w:themeColor="text1"/>
+          <w:sz w:val="24"/>
+          <w:szCs w:val="24"/>
+          <w:lang w:val="en-US"/>
+        </w:rPr>
+        <w:t>về</w:t>
+      </w:r>
+      <w:proofErr w:type="spellEnd"/>
+      <w:r>
+        <w:rPr>
+          <w:rFonts w:ascii="Inter" w:eastAsia="Times New Roman" w:hAnsi="Inter" w:cs="Times New Roman"/>
+          <w:color w:val="000000" w:themeColor="text1"/>
+          <w:sz w:val="24"/>
+          <w:szCs w:val="24"/>
+          <w:lang w:val="en-US"/>
+        </w:rPr>
+        <w:t xml:space="preserve"> </w:t>
+      </w:r>
+      <w:proofErr w:type="spellStart"/>
+      <w:r>
+        <w:rPr>
+          <w:rFonts w:ascii="Inter" w:eastAsia="Times New Roman" w:hAnsi="Inter" w:cs="Times New Roman"/>
+          <w:color w:val="000000" w:themeColor="text1"/>
+          <w:sz w:val="24"/>
+          <w:szCs w:val="24"/>
+          <w:lang w:val="en-US"/>
+        </w:rPr>
+        <w:t>tài</w:t>
+      </w:r>
+      <w:proofErr w:type="spellEnd"/>
+      <w:r>
+        <w:rPr>
+          <w:rFonts w:ascii="Inter" w:eastAsia="Times New Roman" w:hAnsi="Inter" w:cs="Times New Roman"/>
+          <w:color w:val="000000" w:themeColor="text1"/>
+          <w:sz w:val="24"/>
+          <w:szCs w:val="24"/>
+          <w:lang w:val="en-US"/>
+        </w:rPr>
+        <w:t xml:space="preserve"> </w:t>
+      </w:r>
+      <w:proofErr w:type="spellStart"/>
+      <w:r>
+        <w:rPr>
+          <w:rFonts w:ascii="Inter" w:eastAsia="Times New Roman" w:hAnsi="Inter" w:cs="Times New Roman"/>
+          <w:color w:val="000000" w:themeColor="text1"/>
+          <w:sz w:val="24"/>
+          <w:szCs w:val="24"/>
+          <w:lang w:val="en-US"/>
+        </w:rPr>
+        <w:t>chính</w:t>
+      </w:r>
+      <w:proofErr w:type="spellEnd"/>
+      <w:r>
+        <w:rPr>
+          <w:rFonts w:ascii="Inter" w:eastAsia="Times New Roman" w:hAnsi="Inter" w:cs="Times New Roman"/>
+          <w:color w:val="000000" w:themeColor="text1"/>
+          <w:sz w:val="24"/>
+          <w:szCs w:val="24"/>
+          <w:lang w:val="en-US"/>
+        </w:rPr>
+        <w:t xml:space="preserve"> </w:t>
+      </w:r>
+      <w:proofErr w:type="spellStart"/>
+      <w:r>
+        <w:rPr>
+          <w:rFonts w:ascii="Inter" w:eastAsia="Times New Roman" w:hAnsi="Inter" w:cs="Times New Roman"/>
+          <w:color w:val="000000" w:themeColor="text1"/>
+          <w:sz w:val="24"/>
+          <w:szCs w:val="24"/>
+          <w:lang w:val="en-US"/>
+        </w:rPr>
+        <w:t>của</w:t>
+      </w:r>
+      <w:proofErr w:type="spellEnd"/>
+      <w:r>
+        <w:rPr>
+          <w:rFonts w:ascii="Inter" w:eastAsia="Times New Roman" w:hAnsi="Inter" w:cs="Times New Roman"/>
+          <w:color w:val="000000" w:themeColor="text1"/>
+          <w:sz w:val="24"/>
+          <w:szCs w:val="24"/>
+          <w:lang w:val="en-US"/>
+        </w:rPr>
+        <w:t xml:space="preserve"> </w:t>
+      </w:r>
+      <w:proofErr w:type="spellStart"/>
+      <w:r>
+        <w:rPr>
+          <w:rFonts w:ascii="Inter" w:eastAsia="Times New Roman" w:hAnsi="Inter" w:cs="Times New Roman"/>
+          <w:color w:val="000000" w:themeColor="text1"/>
+          <w:sz w:val="24"/>
+          <w:szCs w:val="24"/>
+          <w:lang w:val="en-US"/>
+        </w:rPr>
+        <w:t>hợp</w:t>
+      </w:r>
+      <w:proofErr w:type="spellEnd"/>
+      <w:r>
+        <w:rPr>
+          <w:rFonts w:ascii="Inter" w:eastAsia="Times New Roman" w:hAnsi="Inter" w:cs="Times New Roman"/>
+          <w:color w:val="000000" w:themeColor="text1"/>
+          <w:sz w:val="24"/>
+          <w:szCs w:val="24"/>
+          <w:lang w:val="en-US"/>
+        </w:rPr>
+        <w:t xml:space="preserve"> </w:t>
+      </w:r>
+      <w:proofErr w:type="spellStart"/>
+      <w:r>
+        <w:rPr>
+          <w:rFonts w:ascii="Inter" w:eastAsia="Times New Roman" w:hAnsi="Inter" w:cs="Times New Roman"/>
+          <w:color w:val="000000" w:themeColor="text1"/>
+          <w:sz w:val="24"/>
+          <w:szCs w:val="24"/>
+          <w:lang w:val="en-US"/>
+        </w:rPr>
+        <w:t>đồng</w:t>
+      </w:r>
+      <w:proofErr w:type="spellEnd"/>
+      <w:r>
+        <w:rPr>
+          <w:rFonts w:ascii="Inter" w:eastAsia="Times New Roman" w:hAnsi="Inter" w:cs="Times New Roman"/>
+          <w:color w:val="000000" w:themeColor="text1"/>
+          <w:sz w:val="24"/>
+          <w:szCs w:val="24"/>
+          <w:lang w:val="en-US"/>
+        </w:rPr>
+        <w:t xml:space="preserve"> </w:t>
+      </w:r>
+      <w:proofErr w:type="spellStart"/>
+      <w:r>
+        <w:rPr>
+          <w:rFonts w:ascii="Inter" w:eastAsia="Times New Roman" w:hAnsi="Inter" w:cs="Times New Roman"/>
+          <w:color w:val="000000" w:themeColor="text1"/>
+          <w:sz w:val="24"/>
+          <w:szCs w:val="24"/>
+          <w:lang w:val="en-US"/>
+        </w:rPr>
+        <w:t>số</w:t>
+      </w:r>
+      <w:proofErr w:type="spellEnd"/>
+      <w:r>
+        <w:rPr>
+          <w:rFonts w:ascii="Inter" w:eastAsia="Times New Roman" w:hAnsi="Inter" w:cs="Times New Roman"/>
+          <w:color w:val="000000" w:themeColor="text1"/>
+          <w:sz w:val="24"/>
+          <w:szCs w:val="24"/>
+          <w:lang w:val="en-US"/>
+        </w:rPr>
+        <w:t xml:space="preserve"> </w:t>
+      </w:r>
+      <w:proofErr w:type="gramStart"/>
       <w:r>
         <w:rPr>
           <w:rFonts w:ascii="Inter" w:eastAsia="Inter" w:hAnsi="Inter" w:cs="Inter"/>
@@ -2827,14 +3743,25 @@
         </w:rPr>
         <w:t>order</w:t>
       </w:r>
-      <w:r>
-        <w:rPr>
-          <w:rFonts w:ascii="Inter" w:eastAsia="Inter" w:hAnsi="Inter" w:cs="Inter"/>
-          <w:color w:val="000000" w:themeColor="text1"/>
-          <w:sz w:val="24"/>
-          <w:szCs w:val="24"/>
-        </w:rPr>
-        <w:t>_id</w:t>
+      <w:proofErr w:type="gramEnd"/>
+      <w:r>
+        <w:rPr>
+          <w:rFonts w:ascii="Inter" w:eastAsia="Inter" w:hAnsi="Inter" w:cs="Inter"/>
+          <w:color w:val="000000" w:themeColor="text1"/>
+          <w:sz w:val="24"/>
+          <w:szCs w:val="24"/>
+        </w:rPr>
+        <w:t>_</w:t>
+      </w:r>
+      <w:proofErr w:type="gramStart"/>
+      <w:r>
+        <w:rPr>
+          <w:rFonts w:ascii="Inter" w:eastAsia="Inter" w:hAnsi="Inter" w:cs="Inter"/>
+          <w:color w:val="000000" w:themeColor="text1"/>
+          <w:sz w:val="24"/>
+          <w:szCs w:val="24"/>
+        </w:rPr>
+        <w:t>id</w:t>
       </w:r>
       <w:r>
         <w:rPr>
@@ -2865,6 +3792,7 @@
         </w:rPr>
         <w:t xml:space="preserve">{{ </w:t>
       </w:r>
+      <w:proofErr w:type="spellStart"/>
       <w:r>
         <w:rPr>
           <w:rFonts w:ascii="Inter" w:eastAsia="Inter" w:hAnsi="Inter" w:cs="Inter"/>
@@ -2875,6 +3803,8 @@
         </w:rPr>
         <w:t>yyyy</w:t>
       </w:r>
+      <w:proofErr w:type="spellEnd"/>
+      <w:proofErr w:type="gramEnd"/>
       <w:r>
         <w:rPr>
           <w:rFonts w:ascii="Inter" w:eastAsia="Inter" w:hAnsi="Inter" w:cs="Inter"/>
@@ -2892,7 +3822,17 @@
           <w:sz w:val="24"/>
           <w:szCs w:val="24"/>
         </w:rPr>
-        <w:t>/HĐCG-</w:t>
+        <w:t>/HĐCG</w:t>
+      </w:r>
+      <w:proofErr w:type="gramStart"/>
+      <w:r>
+        <w:rPr>
+          <w:rFonts w:ascii="Inter" w:eastAsia="Inter" w:hAnsi="Inter" w:cs="Inter"/>
+          <w:color w:val="000000" w:themeColor="text1"/>
+          <w:sz w:val="24"/>
+          <w:szCs w:val="24"/>
+        </w:rPr>
+        <w:t>-</w:t>
       </w:r>
       <w:r>
         <w:rPr>
@@ -2904,16 +3844,40 @@
         </w:rPr>
         <w:t xml:space="preserve">{{ </w:t>
       </w:r>
-      <w:r>
-        <w:rPr>
-          <w:rFonts w:ascii="Inter" w:eastAsia="Inter" w:hAnsi="Inter" w:cs="Inter"/>
-          <w:color w:val="000000" w:themeColor="text1"/>
-          <w:sz w:val="24"/>
-          <w:szCs w:val="24"/>
-          <w:lang w:val="en-US"/>
-        </w:rPr>
-        <w:t>abbreviated_project</w:t>
-      </w:r>
+      <w:proofErr w:type="spellStart"/>
+      <w:r>
+        <w:rPr>
+          <w:rFonts w:ascii="Inter" w:eastAsia="Inter" w:hAnsi="Inter" w:cs="Inter"/>
+          <w:color w:val="000000" w:themeColor="text1"/>
+          <w:sz w:val="24"/>
+          <w:szCs w:val="24"/>
+          <w:lang w:val="en-US"/>
+        </w:rPr>
+        <w:t>abbreviated</w:t>
+      </w:r>
+      <w:proofErr w:type="gramEnd"/>
+      <w:r>
+        <w:rPr>
+          <w:rFonts w:ascii="Inter" w:eastAsia="Inter" w:hAnsi="Inter" w:cs="Inter"/>
+          <w:color w:val="000000" w:themeColor="text1"/>
+          <w:sz w:val="24"/>
+          <w:szCs w:val="24"/>
+          <w:lang w:val="en-US"/>
+        </w:rPr>
+        <w:t>_</w:t>
+      </w:r>
+      <w:proofErr w:type="gramStart"/>
+      <w:r>
+        <w:rPr>
+          <w:rFonts w:ascii="Inter" w:eastAsia="Inter" w:hAnsi="Inter" w:cs="Inter"/>
+          <w:color w:val="000000" w:themeColor="text1"/>
+          <w:sz w:val="24"/>
+          <w:szCs w:val="24"/>
+          <w:lang w:val="en-US"/>
+        </w:rPr>
+        <w:t>project</w:t>
+      </w:r>
+      <w:proofErr w:type="spellEnd"/>
       <w:r>
         <w:rPr>
           <w:rFonts w:ascii="Inter" w:eastAsia="Inter" w:hAnsi="Inter" w:cs="Inter"/>
@@ -2924,25 +3888,60 @@
         </w:rPr>
         <w:t xml:space="preserve"> }}{{ </w:t>
       </w:r>
-      <w:r>
-        <w:rPr>
-          <w:rFonts w:ascii="Inter" w:eastAsia="Inter" w:hAnsi="Inter" w:cs="Inter"/>
-          <w:color w:val="000000" w:themeColor="text1"/>
-          <w:sz w:val="24"/>
-          <w:szCs w:val="24"/>
-          <w:lang w:val="en-US"/>
-        </w:rPr>
-        <w:t>additional_information</w:t>
-      </w:r>
-      <w:r>
-        <w:rPr>
-          <w:rFonts w:ascii="Inter" w:eastAsia="Inter" w:hAnsi="Inter" w:cs="Inter"/>
-          <w:color w:val="000000" w:themeColor="text1"/>
-          <w:sz w:val="24"/>
-          <w:szCs w:val="24"/>
-          <w:lang w:val="en-US"/>
-        </w:rPr>
-        <w:t xml:space="preserve"> }}</w:t>
+      <w:proofErr w:type="spellStart"/>
+      <w:r>
+        <w:rPr>
+          <w:rFonts w:ascii="Inter" w:eastAsia="Inter" w:hAnsi="Inter" w:cs="Inter"/>
+          <w:color w:val="000000" w:themeColor="text1"/>
+          <w:sz w:val="24"/>
+          <w:szCs w:val="24"/>
+          <w:lang w:val="en-US"/>
+        </w:rPr>
+        <w:t>additional</w:t>
+      </w:r>
+      <w:proofErr w:type="gramEnd"/>
+      <w:r>
+        <w:rPr>
+          <w:rFonts w:ascii="Inter" w:eastAsia="Inter" w:hAnsi="Inter" w:cs="Inter"/>
+          <w:color w:val="000000" w:themeColor="text1"/>
+          <w:sz w:val="24"/>
+          <w:szCs w:val="24"/>
+          <w:lang w:val="en-US"/>
+        </w:rPr>
+        <w:t>_</w:t>
+      </w:r>
+      <w:proofErr w:type="gramStart"/>
+      <w:r>
+        <w:rPr>
+          <w:rFonts w:ascii="Inter" w:eastAsia="Inter" w:hAnsi="Inter" w:cs="Inter"/>
+          <w:color w:val="000000" w:themeColor="text1"/>
+          <w:sz w:val="24"/>
+          <w:szCs w:val="24"/>
+          <w:lang w:val="en-US"/>
+        </w:rPr>
+        <w:t>information</w:t>
+      </w:r>
+      <w:proofErr w:type="spellEnd"/>
+      <w:r>
+        <w:rPr>
+          <w:rFonts w:ascii="Inter" w:eastAsia="Inter" w:hAnsi="Inter" w:cs="Inter"/>
+          <w:color w:val="000000" w:themeColor="text1"/>
+          <w:sz w:val="24"/>
+          <w:szCs w:val="24"/>
+          <w:lang w:val="en-US"/>
+        </w:rPr>
+        <w:t xml:space="preserve"> }</w:t>
+      </w:r>
+      <w:proofErr w:type="gramEnd"/>
+      <w:r>
+        <w:rPr>
+          <w:rFonts w:ascii="Inter" w:eastAsia="Inter" w:hAnsi="Inter" w:cs="Inter"/>
+          <w:color w:val="000000" w:themeColor="text1"/>
+          <w:sz w:val="24"/>
+          <w:szCs w:val="24"/>
+          <w:lang w:val="en-US"/>
+        </w:rPr>
+        <w:t>}</w:t>
       </w:r>
     </w:p>
     <w:p>
@@ -2957,6 +3956,7 @@
           <w:szCs w:val="24"/>
         </w:rPr>
       </w:pPr>
+      <w:proofErr w:type="spellStart"/>
       <w:r>
         <w:rPr>
           <w:rFonts w:ascii="Inter" w:eastAsia="Times New Roman" w:hAnsi="Inter" w:cs="Times New Roman"/>
@@ -2965,17 +3965,41 @@
           <w:szCs w:val="24"/>
           <w:lang w:val="en-US"/>
         </w:rPr>
-        <w:t>Biên bản</w:t>
-      </w:r>
+        <w:t>Biên</w:t>
+      </w:r>
+      <w:proofErr w:type="spellEnd"/>
       <w:r>
         <w:rPr>
           <w:rFonts w:ascii="Inter" w:eastAsia="Times New Roman" w:hAnsi="Inter" w:cs="Times New Roman"/>
           <w:color w:val="000000" w:themeColor="text1"/>
           <w:sz w:val="24"/>
           <w:szCs w:val="24"/>
+          <w:lang w:val="en-US"/>
+        </w:rPr>
+        <w:t xml:space="preserve"> </w:t>
+      </w:r>
+      <w:proofErr w:type="spellStart"/>
+      <w:r>
+        <w:rPr>
+          <w:rFonts w:ascii="Inter" w:eastAsia="Times New Roman" w:hAnsi="Inter" w:cs="Times New Roman"/>
+          <w:color w:val="000000" w:themeColor="text1"/>
+          <w:sz w:val="24"/>
+          <w:szCs w:val="24"/>
+          <w:lang w:val="en-US"/>
+        </w:rPr>
+        <w:t>bản</w:t>
+      </w:r>
+      <w:proofErr w:type="spellEnd"/>
+      <w:r>
+        <w:rPr>
+          <w:rFonts w:ascii="Inter" w:eastAsia="Times New Roman" w:hAnsi="Inter" w:cs="Times New Roman"/>
+          <w:color w:val="000000" w:themeColor="text1"/>
+          <w:sz w:val="24"/>
+          <w:szCs w:val="24"/>
         </w:rPr>
         <w:t xml:space="preserve"> được lập thành </w:t>
       </w:r>
+      <w:proofErr w:type="spellStart"/>
       <w:r>
         <w:rPr>
           <w:rFonts w:ascii="Inter" w:eastAsia="Times New Roman" w:hAnsi="Inter" w:cs="Times New Roman"/>
@@ -2986,6 +4010,7 @@
         </w:rPr>
         <w:t>hai</w:t>
       </w:r>
+      <w:proofErr w:type="spellEnd"/>
       <w:r>
         <w:rPr>
           <w:rFonts w:ascii="Inter" w:eastAsia="Times New Roman" w:hAnsi="Inter" w:cs="Times New Roman"/>
@@ -3728,7 +4753,7 @@
             </wp:anchor>
           </w:drawing>
         </mc:Choice>
-        <mc:Fallback xmlns:a14="http://schemas.microsoft.com/office/drawing/2010/main" xmlns:pic="http://schemas.openxmlformats.org/drawingml/2006/picture" xmlns:a="http://schemas.openxmlformats.org/drawingml/2006/main">
+        <mc:Fallback xmlns:a="http://schemas.openxmlformats.org/drawingml/2006/main" xmlns:pic="http://schemas.openxmlformats.org/drawingml/2006/picture" xmlns:a14="http://schemas.microsoft.com/office/drawing/2010/main">
           <w:pict w14:anchorId="42E1B52A">
             <v:line id="Straight Connector 3" style="position:absolute;z-index:251659264;visibility:visible;mso-wrap-style:square;mso-width-percent:0;mso-height-percent:0;mso-wrap-distance-left:9pt;mso-wrap-distance-top:-3e-5mm;mso-wrap-distance-right:9pt;mso-wrap-distance-bottom:-3e-5mm;mso-position-horizontal:absolute;mso-position-horizontal-relative:margin;mso-position-vertical:absolute;mso-position-vertical-relative:text;mso-width-percent:0;mso-height-percent:0;mso-width-relative:margin;mso-height-relative:margin" o:spid="_x0000_s1026" strokecolor="#0b4133" strokeweight="1pt" from="-2.1pt,2.6pt" to="471.3pt,2.6pt" w14:anchorId="27534703" o:gfxdata="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">
               <v:stroke joinstyle="miter"/>

</xml_diff>

<commit_message>
fix: format contract display name in word templates and clean placeholders
</commit_message>
<xml_diff>
--- a/template/Template_BBNT.docx
+++ b/template/Template_BBNT.docx
@@ -65,36 +65,7 @@
                 <w:szCs w:val="24"/>
                 <w:lang w:val="en-US"/>
               </w:rPr>
-              <w:t xml:space="preserve">{{ </w:t>
-            </w:r>
-            <w:r>
-              <w:rPr>
-                <w:rFonts w:ascii="Inter" w:eastAsia="Inter" w:hAnsi="Inter" w:cs="Inter"/>
-                <w:color w:val="000000" w:themeColor="text1"/>
-                <w:sz w:val="24"/>
-                <w:szCs w:val="24"/>
-                <w:lang w:val="en-US"/>
-              </w:rPr>
-              <w:t>order</w:t>
-            </w:r>
-            <w:r>
-              <w:rPr>
-                <w:rFonts w:ascii="Inter" w:eastAsia="Inter" w:hAnsi="Inter" w:cs="Inter"/>
-                <w:color w:val="000000" w:themeColor="text1"/>
-                <w:sz w:val="24"/>
-                <w:szCs w:val="24"/>
-              </w:rPr>
-              <w:t>_id</w:t>
-            </w:r>
-            <w:r>
-              <w:rPr>
-                <w:rFonts w:ascii="Inter" w:eastAsia="Inter" w:hAnsi="Inter" w:cs="Inter"/>
-                <w:color w:val="000000" w:themeColor="text1"/>
-                <w:sz w:val="24"/>
-                <w:szCs w:val="24"/>
-                <w:lang w:val="en-US"/>
-              </w:rPr>
-              <w:t xml:space="preserve"> }}</w:t>
+              <w:t xml:space="preserve">{{ order_id }}</w:t>
             </w:r>
             <w:r>
               <w:rPr>
@@ -113,29 +84,7 @@
                 <w:szCs w:val="24"/>
                 <w:lang w:val="en-US"/>
               </w:rPr>
-              <w:t xml:space="preserve">{{ </w:t>
-            </w:r>
-            <w:proofErr w:type="spellStart"/>
-            <w:r>
-              <w:rPr>
-                <w:rFonts w:ascii="Inter" w:eastAsia="Inter" w:hAnsi="Inter" w:cs="Inter"/>
-                <w:color w:val="000000" w:themeColor="text1"/>
-                <w:sz w:val="24"/>
-                <w:szCs w:val="24"/>
-                <w:lang w:val="en-US"/>
-              </w:rPr>
-              <w:t>yyyy</w:t>
-            </w:r>
-            <w:proofErr w:type="spellEnd"/>
-            <w:r>
-              <w:rPr>
-                <w:rFonts w:ascii="Inter" w:eastAsia="Inter" w:hAnsi="Inter" w:cs="Inter"/>
-                <w:color w:val="000000" w:themeColor="text1"/>
-                <w:sz w:val="24"/>
-                <w:szCs w:val="24"/>
-                <w:lang w:val="en-US"/>
-              </w:rPr>
-              <w:t xml:space="preserve"> }}</w:t>
+              <w:t xml:space="preserve">{{ yyyy }}</w:t>
             </w:r>
             <w:r>
               <w:rPr>
@@ -172,51 +121,7 @@
                 <w:szCs w:val="24"/>
                 <w:lang w:val="en-US"/>
               </w:rPr>
-              <w:t xml:space="preserve">{{ </w:t>
-            </w:r>
-            <w:proofErr w:type="spellStart"/>
-            <w:r>
-              <w:rPr>
-                <w:rFonts w:ascii="Inter" w:eastAsia="Inter" w:hAnsi="Inter" w:cs="Inter"/>
-                <w:color w:val="000000" w:themeColor="text1"/>
-                <w:sz w:val="24"/>
-                <w:szCs w:val="24"/>
-                <w:lang w:val="en-US"/>
-              </w:rPr>
-              <w:t>abbreviated_project</w:t>
-            </w:r>
-            <w:proofErr w:type="spellEnd"/>
-            <w:r>
-              <w:rPr>
-                <w:rFonts w:ascii="Inter" w:eastAsia="Inter" w:hAnsi="Inter" w:cs="Inter"/>
-                <w:color w:val="000000" w:themeColor="text1"/>
-                <w:sz w:val="24"/>
-                <w:szCs w:val="24"/>
-                <w:lang w:val="en-US"/>
-              </w:rPr>
-              <w:t xml:space="preserve"> }}{{ </w:t>
-            </w:r>
-            <w:proofErr w:type="spellStart"/>
-            <w:r>
-              <w:rPr>
-                <w:rFonts w:ascii="Inter" w:eastAsia="Inter" w:hAnsi="Inter" w:cs="Inter"/>
-                <w:color w:val="000000" w:themeColor="text1"/>
-                <w:sz w:val="24"/>
-                <w:szCs w:val="24"/>
-                <w:lang w:val="en-US"/>
-              </w:rPr>
-              <w:t>additional_information</w:t>
-            </w:r>
-            <w:proofErr w:type="spellEnd"/>
-            <w:r>
-              <w:rPr>
-                <w:rFonts w:ascii="Inter" w:eastAsia="Inter" w:hAnsi="Inter" w:cs="Inter"/>
-                <w:color w:val="000000" w:themeColor="text1"/>
-                <w:sz w:val="24"/>
-                <w:szCs w:val="24"/>
-                <w:lang w:val="en-US"/>
-              </w:rPr>
-              <w:t xml:space="preserve"> }}</w:t>
+              <w:t xml:space="preserve">{{ abbreviated_project }}{{ additional_information }}</w:t>
             </w:r>
           </w:p>
         </w:tc>
@@ -257,27 +162,7 @@
                 <w:szCs w:val="24"/>
                 <w:lang w:val="en-US"/>
               </w:rPr>
-              <w:t xml:space="preserve">{{ </w:t>
-            </w:r>
-            <w:r>
-              <w:rPr>
-                <w:rFonts w:ascii="Inter" w:eastAsia="Inter" w:hAnsi="Inter" w:cs="Inter"/>
-                <w:color w:val="000000" w:themeColor="text1"/>
-                <w:sz w:val="24"/>
-                <w:szCs w:val="24"/>
-                <w:lang w:val="en-US"/>
-              </w:rPr>
-              <w:t>dd</w:t>
-            </w:r>
-            <w:r>
-              <w:rPr>
-                <w:rFonts w:ascii="Inter" w:eastAsia="Inter" w:hAnsi="Inter" w:cs="Inter"/>
-                <w:color w:val="000000" w:themeColor="text1"/>
-                <w:sz w:val="24"/>
-                <w:szCs w:val="24"/>
-                <w:lang w:val="en-US"/>
-              </w:rPr>
-              <w:t xml:space="preserve"> }}</w:t>
+              <w:t xml:space="preserve">{{ dd }}</w:t>
             </w:r>
             <w:r>
               <w:rPr>
@@ -296,27 +181,7 @@
                 <w:szCs w:val="24"/>
                 <w:lang w:val="en-US"/>
               </w:rPr>
-              <w:t xml:space="preserve">{{ </w:t>
-            </w:r>
-            <w:r>
-              <w:rPr>
-                <w:rFonts w:ascii="Inter" w:eastAsia="Inter" w:hAnsi="Inter" w:cs="Inter"/>
-                <w:color w:val="000000" w:themeColor="text1"/>
-                <w:sz w:val="24"/>
-                <w:szCs w:val="24"/>
-                <w:lang w:val="en-US"/>
-              </w:rPr>
-              <w:t>mm</w:t>
-            </w:r>
-            <w:r>
-              <w:rPr>
-                <w:rFonts w:ascii="Inter" w:eastAsia="Inter" w:hAnsi="Inter" w:cs="Inter"/>
-                <w:color w:val="000000" w:themeColor="text1"/>
-                <w:sz w:val="24"/>
-                <w:szCs w:val="24"/>
-                <w:lang w:val="en-US"/>
-              </w:rPr>
-              <w:t xml:space="preserve"> }}</w:t>
+              <w:t xml:space="preserve">{{ mm }}</w:t>
             </w:r>
             <w:r>
               <w:rPr>
@@ -335,29 +200,7 @@
                 <w:szCs w:val="24"/>
                 <w:lang w:val="en-US"/>
               </w:rPr>
-              <w:t xml:space="preserve">{{ </w:t>
-            </w:r>
-            <w:proofErr w:type="spellStart"/>
-            <w:r>
-              <w:rPr>
-                <w:rFonts w:ascii="Inter" w:eastAsia="Inter" w:hAnsi="Inter" w:cs="Inter"/>
-                <w:color w:val="000000" w:themeColor="text1"/>
-                <w:sz w:val="24"/>
-                <w:szCs w:val="24"/>
-                <w:lang w:val="en-US"/>
-              </w:rPr>
-              <w:t>yyyy</w:t>
-            </w:r>
-            <w:proofErr w:type="spellEnd"/>
-            <w:r>
-              <w:rPr>
-                <w:rFonts w:ascii="Inter" w:eastAsia="Inter" w:hAnsi="Inter" w:cs="Inter"/>
-                <w:color w:val="000000" w:themeColor="text1"/>
-                <w:sz w:val="24"/>
-                <w:szCs w:val="24"/>
-                <w:lang w:val="en-US"/>
-              </w:rPr>
-              <w:t xml:space="preserve"> }}</w:t>
+              <w:t xml:space="preserve">{{ yyyy }}</w:t>
             </w:r>
             <w:r>
               <w:rPr>
@@ -565,7 +408,7 @@
           <w:szCs w:val="24"/>
           <w:lang w:val="en-US"/>
         </w:rPr>
-        <w:t xml:space="preserve">{{ </w:t>
+        <w:t xml:space="preserve">{{ dd }}</w:t>
       </w:r>
       <w:r>
         <w:rPr>
@@ -575,9 +418,8 @@
           <w:color w:val="000000" w:themeColor="text1"/>
           <w:sz w:val="24"/>
           <w:szCs w:val="24"/>
-          <w:lang w:val="en-US"/>
-        </w:rPr>
-        <w:t>dd</w:t>
+        </w:rPr>
+        <w:t xml:space="preserve"> tháng </w:t>
       </w:r>
       <w:r>
         <w:rPr>
@@ -589,7 +431,7 @@
           <w:szCs w:val="24"/>
           <w:lang w:val="en-US"/>
         </w:rPr>
-        <w:t xml:space="preserve"> }}</w:t>
+        <w:t xml:space="preserve">{{ mm }}</w:t>
       </w:r>
       <w:r>
         <w:rPr>
@@ -600,7 +442,7 @@
           <w:sz w:val="24"/>
           <w:szCs w:val="24"/>
         </w:rPr>
-        <w:t xml:space="preserve"> tháng </w:t>
+        <w:t xml:space="preserve"> năm </w:t>
       </w:r>
       <w:r>
         <w:rPr>
@@ -612,80 +454,7 @@
           <w:szCs w:val="24"/>
           <w:lang w:val="en-US"/>
         </w:rPr>
-        <w:t xml:space="preserve">{{ </w:t>
-      </w:r>
-      <w:r>
-        <w:rPr>
-          <w:rFonts w:ascii="Inter" w:eastAsia="Inter" w:hAnsi="Inter" w:cs="Inter"/>
-          <w:i/>
-          <w:iCs/>
-          <w:color w:val="000000" w:themeColor="text1"/>
-          <w:sz w:val="24"/>
-          <w:szCs w:val="24"/>
-          <w:lang w:val="en-US"/>
-        </w:rPr>
-        <w:t>mm</w:t>
-      </w:r>
-      <w:r>
-        <w:rPr>
-          <w:rFonts w:ascii="Inter" w:eastAsia="Inter" w:hAnsi="Inter" w:cs="Inter"/>
-          <w:i/>
-          <w:iCs/>
-          <w:color w:val="000000" w:themeColor="text1"/>
-          <w:sz w:val="24"/>
-          <w:szCs w:val="24"/>
-          <w:lang w:val="en-US"/>
-        </w:rPr>
-        <w:t xml:space="preserve"> }}</w:t>
-      </w:r>
-      <w:r>
-        <w:rPr>
-          <w:rFonts w:ascii="Inter" w:eastAsia="Inter" w:hAnsi="Inter" w:cs="Inter"/>
-          <w:i/>
-          <w:iCs/>
-          <w:color w:val="000000" w:themeColor="text1"/>
-          <w:sz w:val="24"/>
-          <w:szCs w:val="24"/>
-        </w:rPr>
-        <w:t xml:space="preserve"> năm </w:t>
-      </w:r>
-      <w:r>
-        <w:rPr>
-          <w:rFonts w:ascii="Inter" w:eastAsia="Inter" w:hAnsi="Inter" w:cs="Inter"/>
-          <w:i/>
-          <w:iCs/>
-          <w:color w:val="000000" w:themeColor="text1"/>
-          <w:sz w:val="24"/>
-          <w:szCs w:val="24"/>
-          <w:lang w:val="en-US"/>
-        </w:rPr>
-        <w:t xml:space="preserve">{{ </w:t>
-      </w:r>
-      <w:proofErr w:type="spellStart"/>
-      <w:r>
-        <w:rPr>
-          <w:rFonts w:ascii="Inter" w:eastAsia="Inter" w:hAnsi="Inter" w:cs="Inter"/>
-          <w:i/>
-          <w:iCs/>
-          <w:color w:val="000000" w:themeColor="text1"/>
-          <w:sz w:val="24"/>
-          <w:szCs w:val="24"/>
-          <w:lang w:val="en-US"/>
-        </w:rPr>
-        <w:t>yyyy</w:t>
-      </w:r>
-      <w:proofErr w:type="spellEnd"/>
-      <w:r>
-        <w:rPr>
-          <w:rFonts w:ascii="Inter" w:eastAsia="Inter" w:hAnsi="Inter" w:cs="Inter"/>
-          <w:i/>
-          <w:iCs/>
-          <w:color w:val="000000" w:themeColor="text1"/>
-          <w:sz w:val="24"/>
-          <w:szCs w:val="24"/>
-          <w:lang w:val="en-US"/>
-        </w:rPr>
-        <w:t xml:space="preserve"> }}</w:t>
+        <w:t xml:space="preserve">{{ yyyy }}</w:t>
       </w:r>
       <w:r>
         <w:rPr>
@@ -982,11 +751,10 @@
           <w:szCs w:val="24"/>
           <w:lang w:val="en-US"/>
         </w:rPr>
-        <w:t xml:space="preserve">{{ </w:t>
-      </w:r>
-      <w:r>
-        <w:rPr>
-          <w:rStyle w:val="normaltextrun"/>
+        <w:t xml:space="preserve">{{ pronoun }}</w:t>
+      </w:r>
+      <w:r>
+        <w:rPr>
           <w:rFonts w:ascii="Inter" w:eastAsia="Inter" w:hAnsi="Inter" w:cs="Inter"/>
           <w:b/>
           <w:bCs/>
@@ -994,9 +762,8 @@
           <w:color w:val="000000" w:themeColor="text1"/>
           <w:sz w:val="24"/>
           <w:szCs w:val="24"/>
-          <w:lang w:val="en-US"/>
-        </w:rPr>
-        <w:t>pronoun</w:t>
+        </w:rPr>
+        <w:t xml:space="preserve"> </w:t>
       </w:r>
       <w:r>
         <w:rPr>
@@ -1010,61 +777,7 @@
           <w:szCs w:val="24"/>
           <w:lang w:val="en-US"/>
         </w:rPr>
-        <w:t xml:space="preserve"> }}</w:t>
-      </w:r>
-      <w:r>
-        <w:rPr>
-          <w:rFonts w:ascii="Inter" w:eastAsia="Inter" w:hAnsi="Inter" w:cs="Inter"/>
-          <w:b/>
-          <w:bCs/>
-          <w:noProof/>
-          <w:color w:val="000000" w:themeColor="text1"/>
-          <w:sz w:val="24"/>
-          <w:szCs w:val="24"/>
-        </w:rPr>
-        <w:t xml:space="preserve"> </w:t>
-      </w:r>
-      <w:r>
-        <w:rPr>
-          <w:rStyle w:val="normaltextrun"/>
-          <w:rFonts w:ascii="Inter" w:eastAsia="Inter" w:hAnsi="Inter" w:cs="Inter"/>
-          <w:b/>
-          <w:bCs/>
-          <w:noProof/>
-          <w:color w:val="000000" w:themeColor="text1"/>
-          <w:sz w:val="24"/>
-          <w:szCs w:val="24"/>
-          <w:lang w:val="en-US"/>
-        </w:rPr>
-        <w:t xml:space="preserve">{{ </w:t>
-      </w:r>
-      <w:r>
-        <w:rPr>
-          <w:rStyle w:val="normaltextrun"/>
-          <w:rFonts w:ascii="Inter" w:eastAsia="Inter" w:hAnsi="Inter" w:cs="Inter"/>
-          <w:b/>
-          <w:bCs/>
-          <w:noProof/>
-          <w:color w:val="000000" w:themeColor="text1"/>
-          <w:sz w:val="24"/>
-          <w:szCs w:val="24"/>
-          <w:lang w:val="en-US"/>
-        </w:rPr>
-        <w:t>expert_name</w:t>
-      </w:r>
-      <w:r>
-        <w:rPr>
-          <w:rStyle w:val="normaltextrun"/>
-          <w:rFonts w:ascii="Inter" w:eastAsia="Inter" w:hAnsi="Inter" w:cs="Inter"/>
-          <w:b/>
-          <w:bCs/>
-          <w:noProof/>
-          <w:color w:val="000000" w:themeColor="text1"/>
-          <w:sz w:val="24"/>
-          <w:szCs w:val="24"/>
-          <w:lang w:val="en-US"/>
-        </w:rPr>
-        <w:t xml:space="preserve"> }}</w:t>
+        <w:t xml:space="preserve">{{ expert_name }}</w:t>
       </w:r>
     </w:p>
     <w:p>
@@ -1102,29 +815,7 @@
           <w:szCs w:val="24"/>
           <w:lang w:val="en-US"/>
         </w:rPr>
-        <w:t xml:space="preserve">{{ </w:t>
-      </w:r>
-      <w:r>
-        <w:rPr>
-          <w:rFonts w:ascii="Inter" w:eastAsia="Inter" w:hAnsi="Inter" w:cs="Inter"/>
-          <w:noProof/>
-          <w:color w:val="000000" w:themeColor="text1"/>
-          <w:sz w:val="24"/>
-          <w:szCs w:val="24"/>
-          <w:lang w:val="en-US"/>
-        </w:rPr>
-        <w:t>nationality</w:t>
-      </w:r>
-      <w:r>
-        <w:rPr>
-          <w:rFonts w:ascii="Inter" w:eastAsia="Inter" w:hAnsi="Inter" w:cs="Inter"/>
-          <w:noProof/>
-          <w:color w:val="000000" w:themeColor="text1"/>
-          <w:sz w:val="24"/>
-          <w:szCs w:val="24"/>
-          <w:lang w:val="en-US"/>
-        </w:rPr>
-        <w:t xml:space="preserve"> }}</w:t>
+        <w:t xml:space="preserve">{{ nationality }}</w:t>
       </w:r>
     </w:p>
     <w:p>
@@ -1162,29 +853,7 @@
           <w:szCs w:val="24"/>
           <w:lang w:val="en-US"/>
         </w:rPr>
-        <w:t xml:space="preserve">{{ </w:t>
-      </w:r>
-      <w:r>
-        <w:rPr>
-          <w:rFonts w:ascii="Inter" w:eastAsia="Inter" w:hAnsi="Inter" w:cs="Inter"/>
-          <w:noProof/>
-          <w:color w:val="000000" w:themeColor="text1"/>
-          <w:sz w:val="24"/>
-          <w:szCs w:val="24"/>
-          <w:lang w:val="en-US"/>
-        </w:rPr>
-        <w:t>address</w:t>
-      </w:r>
-      <w:r>
-        <w:rPr>
-          <w:rFonts w:ascii="Inter" w:eastAsia="Inter" w:hAnsi="Inter" w:cs="Inter"/>
-          <w:noProof/>
-          <w:color w:val="000000" w:themeColor="text1"/>
-          <w:sz w:val="24"/>
-          <w:szCs w:val="24"/>
-          <w:lang w:val="en-US"/>
-        </w:rPr>
-        <w:t xml:space="preserve"> }}</w:t>
+        <w:t xml:space="preserve">{{ address }}</w:t>
       </w:r>
     </w:p>
     <w:p>
@@ -1222,7 +891,10 @@
           <w:szCs w:val="24"/>
           <w:lang w:val="en-US"/>
         </w:rPr>
-        <w:t xml:space="preserve">{{ </w:t>
+        <w:t xml:space="preserve">{{ id_number }}</w:t>
+      </w:r>
+      <w:r>
+        <w:tab/>
       </w:r>
       <w:r>
         <w:rPr>
@@ -1231,9 +903,8 @@
           <w:color w:val="000000" w:themeColor="text1"/>
           <w:sz w:val="24"/>
           <w:szCs w:val="24"/>
-          <w:lang w:val="en-US"/>
-        </w:rPr>
-        <w:t>id_number</w:t>
+        </w:rPr>
+        <w:t xml:space="preserve"> Ngày cấp: </w:t>
       </w:r>
       <w:r>
         <w:rPr>
@@ -1244,53 +915,7 @@
           <w:szCs w:val="24"/>
           <w:lang w:val="en-US"/>
         </w:rPr>
-        <w:t xml:space="preserve"> }}</w:t>
-      </w:r>
-      <w:r>
-        <w:tab/>
-      </w:r>
-      <w:r>
-        <w:rPr>
-          <w:rFonts w:ascii="Inter" w:eastAsia="Inter" w:hAnsi="Inter" w:cs="Inter"/>
-          <w:noProof/>
-          <w:color w:val="000000" w:themeColor="text1"/>
-          <w:sz w:val="24"/>
-          <w:szCs w:val="24"/>
-        </w:rPr>
-        <w:t xml:space="preserve"> Ngày cấp: </w:t>
-      </w:r>
-      <w:r>
-        <w:rPr>
-          <w:rFonts w:ascii="Inter" w:eastAsia="Inter" w:hAnsi="Inter" w:cs="Inter"/>
-          <w:noProof/>
-          <w:color w:val="000000" w:themeColor="text1"/>
-          <w:sz w:val="24"/>
-          <w:szCs w:val="24"/>
-          <w:lang w:val="en-US"/>
-        </w:rPr>
-        <w:t xml:space="preserve">{{ </w:t>
-      </w:r>
-      <w:r>
-        <w:rPr>
-          <w:rFonts w:ascii="Inter" w:eastAsia="Inter" w:hAnsi="Inter" w:cs="Inter"/>
-          <w:noProof/>
-          <w:color w:val="000000" w:themeColor="text1"/>
-          <w:sz w:val="24"/>
-          <w:szCs w:val="24"/>
-          <w:lang w:val="en-US"/>
-        </w:rPr>
-        <w:t>issued_date</w:t>
-      </w:r>
-      <w:r>
-        <w:rPr>
-          <w:rFonts w:ascii="Inter" w:eastAsia="Inter" w:hAnsi="Inter" w:cs="Inter"/>
-          <w:noProof/>
-          <w:color w:val="000000" w:themeColor="text1"/>
-          <w:sz w:val="24"/>
-          <w:szCs w:val="24"/>
-          <w:lang w:val="en-US"/>
-        </w:rPr>
-        <w:t xml:space="preserve"> }}</w:t>
+        <w:t xml:space="preserve">{{ issued_date }}</w:t>
       </w:r>
       <w:r>
         <w:rPr>
@@ -1338,29 +963,7 @@
           <w:szCs w:val="24"/>
           <w:lang w:val="en-US"/>
         </w:rPr>
-        <w:t xml:space="preserve">{{ </w:t>
-      </w:r>
-      <w:r>
-        <w:rPr>
-          <w:rFonts w:ascii="Inter" w:eastAsia="Inter" w:hAnsi="Inter" w:cs="Inter"/>
-          <w:noProof/>
-          <w:color w:val="000000" w:themeColor="text1"/>
-          <w:sz w:val="24"/>
-          <w:szCs w:val="24"/>
-          <w:lang w:val="en-US"/>
-        </w:rPr>
-        <w:t>issued_place</w:t>
-      </w:r>
-      <w:r>
-        <w:rPr>
-          <w:rFonts w:ascii="Inter" w:eastAsia="Inter" w:hAnsi="Inter" w:cs="Inter"/>
-          <w:noProof/>
-          <w:color w:val="000000" w:themeColor="text1"/>
-          <w:sz w:val="24"/>
-          <w:szCs w:val="24"/>
-          <w:lang w:val="en-US"/>
-        </w:rPr>
-        <w:t xml:space="preserve"> }}</w:t>
+        <w:t xml:space="preserve">{{ issued_place }}</w:t>
       </w:r>
       <w:r>
         <w:rPr>
@@ -1408,7 +1011,7 @@
           <w:szCs w:val="24"/>
           <w:lang w:val="en-US"/>
         </w:rPr>
-        <w:t xml:space="preserve">{{ </w:t>
+        <w:t xml:space="preserve">{{ email_address }}</w:t>
       </w:r>
       <w:r>
         <w:rPr>
@@ -1417,9 +1020,14 @@
           <w:color w:val="000000" w:themeColor="text1"/>
           <w:sz w:val="24"/>
           <w:szCs w:val="24"/>
-          <w:lang w:val="en-US"/>
-        </w:rPr>
-        <w:t>email_address</w:t>
+        </w:rPr>
+        <w:t xml:space="preserve"> </w:t>
+      </w:r>
+      <w:r>
+        <w:tab/>
+      </w:r>
+      <w:r>
+        <w:tab/>
       </w:r>
       <w:r>
         <w:rPr>
@@ -1430,7 +1038,7 @@
           <w:szCs w:val="24"/>
           <w:lang w:val="en-US"/>
         </w:rPr>
-        <w:t xml:space="preserve"> }}</w:t>
+        <w:t xml:space="preserve">Số điện thoại: </w:t>
       </w:r>
       <w:r>
         <w:rPr>
@@ -1439,58 +1047,9 @@
           <w:color w:val="000000" w:themeColor="text1"/>
           <w:sz w:val="24"/>
           <w:szCs w:val="24"/>
-        </w:rPr>
-        <w:t xml:space="preserve"> </w:t>
-      </w:r>
-      <w:r>
-        <w:tab/>
-      </w:r>
-      <w:r>
-        <w:tab/>
-      </w:r>
-      <w:r>
-        <w:rPr>
-          <w:rFonts w:ascii="Inter" w:eastAsia="Inter" w:hAnsi="Inter" w:cs="Inter"/>
-          <w:noProof/>
-          <w:color w:val="000000" w:themeColor="text1"/>
-          <w:sz w:val="24"/>
-          <w:szCs w:val="24"/>
-          <w:lang w:val="en-US"/>
-        </w:rPr>
-        <w:t xml:space="preserve">Số điện thoại: </w:t>
-      </w:r>
-      <w:r>
-        <w:rPr>
-          <w:rFonts w:ascii="Inter" w:eastAsia="Inter" w:hAnsi="Inter" w:cs="Inter"/>
-          <w:noProof/>
-          <w:color w:val="000000" w:themeColor="text1"/>
-          <w:sz w:val="24"/>
-          <w:szCs w:val="24"/>
-          <w:lang w:val="en-US"/>
-        </w:rPr>
-        <w:t xml:space="preserve">{{ </w:t>
-      </w:r>
-      <w:r>
-        <w:rPr>
-          <w:rFonts w:ascii="Inter" w:eastAsia="Inter" w:hAnsi="Inter" w:cs="Inter"/>
-          <w:noProof/>
-          <w:color w:val="000000" w:themeColor="text1"/>
-          <w:sz w:val="24"/>
-          <w:szCs w:val="24"/>
-          <w:lang w:val="en-US"/>
-        </w:rPr>
-        <w:t>phone</w:t>
-      </w:r>
-      <w:r>
-        <w:rPr>
-          <w:rFonts w:ascii="Inter" w:eastAsia="Inter" w:hAnsi="Inter" w:cs="Inter"/>
-          <w:noProof/>
-          <w:color w:val="000000" w:themeColor="text1"/>
-          <w:sz w:val="24"/>
-          <w:szCs w:val="24"/>
-          <w:lang w:val="en-US"/>
-        </w:rPr>
-        <w:t xml:space="preserve"> }}</w:t>
+          <w:lang w:val="en-US"/>
+        </w:rPr>
+        <w:t xml:space="preserve">{{ phone }}</w:t>
       </w:r>
     </w:p>
     <w:p>
@@ -1528,7 +1087,7 @@
           <w:szCs w:val="24"/>
           <w:lang w:val="en-US"/>
         </w:rPr>
-        <w:t xml:space="preserve">{{ </w:t>
+        <w:t xml:space="preserve">{{ bank_account }}</w:t>
       </w:r>
       <w:r>
         <w:rPr>
@@ -1537,9 +1096,8 @@
           <w:color w:val="000000" w:themeColor="text1"/>
           <w:sz w:val="24"/>
           <w:szCs w:val="24"/>
-          <w:lang w:val="en-US"/>
-        </w:rPr>
-        <w:t>bank_account</w:t>
+        </w:rPr>
+        <w:t xml:space="preserve"> tại </w:t>
       </w:r>
       <w:r>
         <w:rPr>
@@ -1550,50 +1108,7 @@
           <w:szCs w:val="24"/>
           <w:lang w:val="en-US"/>
         </w:rPr>
-        <w:t xml:space="preserve"> }}</w:t>
-      </w:r>
-      <w:r>
-        <w:rPr>
-          <w:rFonts w:ascii="Inter" w:eastAsia="Inter" w:hAnsi="Inter" w:cs="Inter"/>
-          <w:noProof/>
-          <w:color w:val="000000" w:themeColor="text1"/>
-          <w:sz w:val="24"/>
-          <w:szCs w:val="24"/>
-        </w:rPr>
-        <w:t xml:space="preserve"> tại </w:t>
-      </w:r>
-      <w:r>
-        <w:rPr>
-          <w:rFonts w:ascii="Inter" w:eastAsia="Inter" w:hAnsi="Inter" w:cs="Inter"/>
-          <w:noProof/>
-          <w:color w:val="000000" w:themeColor="text1"/>
-          <w:sz w:val="24"/>
-          <w:szCs w:val="24"/>
-          <w:lang w:val="en-US"/>
-        </w:rPr>
-        <w:t xml:space="preserve">{{ </w:t>
-      </w:r>
-      <w:r>
-        <w:rPr>
-          <w:rFonts w:ascii="Inter" w:eastAsia="Inter" w:hAnsi="Inter" w:cs="Inter"/>
-          <w:noProof/>
-          <w:color w:val="000000" w:themeColor="text1"/>
-          <w:sz w:val="24"/>
-          <w:szCs w:val="24"/>
-          <w:lang w:val="en-US"/>
-        </w:rPr>
-        <w:t>bank_name</w:t>
-      </w:r>
-      <w:r>
-        <w:rPr>
-          <w:rFonts w:ascii="Inter" w:eastAsia="Inter" w:hAnsi="Inter" w:cs="Inter"/>
-          <w:noProof/>
-          <w:color w:val="000000" w:themeColor="text1"/>
-          <w:sz w:val="24"/>
-          <w:szCs w:val="24"/>
-          <w:lang w:val="en-US"/>
-        </w:rPr>
-        <w:t xml:space="preserve"> }}</w:t>
+        <w:t xml:space="preserve">{{ bank_name }}</w:t>
       </w:r>
     </w:p>
     <w:p>
@@ -1625,27 +1140,7 @@
           <w:szCs w:val="24"/>
           <w:lang w:val="en-US"/>
         </w:rPr>
-        <w:t xml:space="preserve">{{ </w:t>
-      </w:r>
-      <w:r>
-        <w:rPr>
-          <w:rFonts w:ascii="Inter" w:eastAsia="Inter" w:hAnsi="Inter" w:cs="Inter"/>
-          <w:color w:val="000000" w:themeColor="text1"/>
-          <w:sz w:val="24"/>
-          <w:szCs w:val="24"/>
-          <w:lang w:val="en-US"/>
-        </w:rPr>
-        <w:t>order</w:t>
-      </w:r>
-      <w:r>
-        <w:rPr>
-          <w:rFonts w:ascii="Inter" w:eastAsia="Inter" w:hAnsi="Inter" w:cs="Inter"/>
-          <w:color w:val="000000" w:themeColor="text1"/>
-          <w:sz w:val="24"/>
-          <w:szCs w:val="24"/>
-          <w:lang w:val="en-US"/>
-        </w:rPr>
-        <w:t xml:space="preserve"> }}</w:t>
+        <w:t xml:space="preserve">{{ order }}</w:t>
       </w:r>
       <w:r>
         <w:rPr>
@@ -1664,29 +1159,7 @@
           <w:szCs w:val="24"/>
           <w:lang w:val="en-US"/>
         </w:rPr>
-        <w:t xml:space="preserve">{{ </w:t>
-      </w:r>
-      <w:proofErr w:type="spellStart"/>
-      <w:r>
-        <w:rPr>
-          <w:rFonts w:ascii="Inter" w:eastAsia="Inter" w:hAnsi="Inter" w:cs="Inter"/>
-          <w:color w:val="000000" w:themeColor="text1"/>
-          <w:sz w:val="24"/>
-          <w:szCs w:val="24"/>
-          <w:lang w:val="en-US"/>
-        </w:rPr>
-        <w:t>yyyy</w:t>
-      </w:r>
-      <w:proofErr w:type="spellEnd"/>
-      <w:r>
-        <w:rPr>
-          <w:rFonts w:ascii="Inter" w:eastAsia="Inter" w:hAnsi="Inter" w:cs="Inter"/>
-          <w:color w:val="000000" w:themeColor="text1"/>
-          <w:sz w:val="24"/>
-          <w:szCs w:val="24"/>
-          <w:lang w:val="en-US"/>
-        </w:rPr>
-        <w:t xml:space="preserve"> }}</w:t>
+        <w:t xml:space="preserve">{{ yyyy }}</w:t>
       </w:r>
       <w:r>
         <w:rPr>
@@ -1705,51 +1178,7 @@
           <w:szCs w:val="24"/>
           <w:lang w:val="en-US"/>
         </w:rPr>
-        <w:t xml:space="preserve">{{ </w:t>
-      </w:r>
-      <w:proofErr w:type="spellStart"/>
-      <w:r>
-        <w:rPr>
-          <w:rFonts w:ascii="Inter" w:eastAsia="Inter" w:hAnsi="Inter" w:cs="Inter"/>
-          <w:color w:val="000000" w:themeColor="text1"/>
-          <w:sz w:val="24"/>
-          <w:szCs w:val="24"/>
-          <w:lang w:val="en-US"/>
-        </w:rPr>
-        <w:t>abbreviated_project</w:t>
-      </w:r>
-      <w:proofErr w:type="spellEnd"/>
-      <w:r>
-        <w:rPr>
-          <w:rFonts w:ascii="Inter" w:eastAsia="Inter" w:hAnsi="Inter" w:cs="Inter"/>
-          <w:color w:val="000000" w:themeColor="text1"/>
-          <w:sz w:val="24"/>
-          <w:szCs w:val="24"/>
-          <w:lang w:val="en-US"/>
-        </w:rPr>
-        <w:t xml:space="preserve"> }}{{ </w:t>
-      </w:r>
-      <w:proofErr w:type="spellStart"/>
-      <w:r>
-        <w:rPr>
-          <w:rFonts w:ascii="Inter" w:eastAsia="Inter" w:hAnsi="Inter" w:cs="Inter"/>
-          <w:color w:val="000000" w:themeColor="text1"/>
-          <w:sz w:val="24"/>
-          <w:szCs w:val="24"/>
-          <w:lang w:val="en-US"/>
-        </w:rPr>
-        <w:t>additional_information</w:t>
-      </w:r>
-      <w:proofErr w:type="spellEnd"/>
-      <w:r>
-        <w:rPr>
-          <w:rFonts w:ascii="Inter" w:eastAsia="Inter" w:hAnsi="Inter" w:cs="Inter"/>
-          <w:color w:val="000000" w:themeColor="text1"/>
-          <w:sz w:val="24"/>
-          <w:szCs w:val="24"/>
-          <w:lang w:val="en-US"/>
-        </w:rPr>
-        <w:t xml:space="preserve"> }}</w:t>
+        <w:t xml:space="preserve">{{ abbreviated_project }}{{ additional_information }}</w:t>
       </w:r>
       <w:r>
         <w:rPr>
@@ -3731,27 +3160,35 @@
           <w:szCs w:val="24"/>
           <w:lang w:val="en-US"/>
         </w:rPr>
-        <w:t xml:space="preserve">{{ </w:t>
-      </w:r>
-      <w:r>
-        <w:rPr>
-          <w:rFonts w:ascii="Inter" w:eastAsia="Inter" w:hAnsi="Inter" w:cs="Inter"/>
-          <w:color w:val="000000" w:themeColor="text1"/>
-          <w:sz w:val="24"/>
-          <w:szCs w:val="24"/>
-          <w:lang w:val="en-US"/>
-        </w:rPr>
-        <w:t>order</w:t>
-      </w:r>
-      <w:proofErr w:type="gramEnd"/>
-      <w:r>
-        <w:rPr>
-          <w:rFonts w:ascii="Inter" w:eastAsia="Inter" w:hAnsi="Inter" w:cs="Inter"/>
-          <w:color w:val="000000" w:themeColor="text1"/>
-          <w:sz w:val="24"/>
-          <w:szCs w:val="24"/>
-        </w:rPr>
-        <w:t>_</w:t>
+        <w:t xml:space="preserve">{{ order_id }}</w:t>
+      </w:r>
+      <w:r>
+        <w:rPr>
+          <w:rFonts w:ascii="Inter" w:eastAsia="Inter" w:hAnsi="Inter" w:cs="Inter"/>
+          <w:color w:val="000000" w:themeColor="text1"/>
+          <w:sz w:val="24"/>
+          <w:szCs w:val="24"/>
+        </w:rPr>
+        <w:t>/</w:t>
+      </w:r>
+      <w:r>
+        <w:rPr>
+          <w:rFonts w:ascii="Inter" w:eastAsia="Inter" w:hAnsi="Inter" w:cs="Inter"/>
+          <w:color w:val="000000" w:themeColor="text1"/>
+          <w:sz w:val="24"/>
+          <w:szCs w:val="24"/>
+          <w:lang w:val="en-US"/>
+        </w:rPr>
+        <w:t xml:space="preserve">{{ yyyy }}</w:t>
+      </w:r>
+      <w:r>
+        <w:rPr>
+          <w:rFonts w:ascii="Inter" w:eastAsia="Inter" w:hAnsi="Inter" w:cs="Inter"/>
+          <w:color w:val="000000" w:themeColor="text1"/>
+          <w:sz w:val="24"/>
+          <w:szCs w:val="24"/>
+        </w:rPr>
+        <w:t>/HĐCG</w:t>
       </w:r>
       <w:proofErr w:type="gramStart"/>
       <w:r>
@@ -3761,77 +3198,6 @@
           <w:sz w:val="24"/>
           <w:szCs w:val="24"/>
         </w:rPr>
-        <w:t>id</w:t>
-      </w:r>
-      <w:r>
-        <w:rPr>
-          <w:rFonts w:ascii="Inter" w:eastAsia="Inter" w:hAnsi="Inter" w:cs="Inter"/>
-          <w:color w:val="000000" w:themeColor="text1"/>
-          <w:sz w:val="24"/>
-          <w:szCs w:val="24"/>
-          <w:lang w:val="en-US"/>
-        </w:rPr>
-        <w:t xml:space="preserve"> }}</w:t>
-      </w:r>
-      <w:r>
-        <w:rPr>
-          <w:rFonts w:ascii="Inter" w:eastAsia="Inter" w:hAnsi="Inter" w:cs="Inter"/>
-          <w:color w:val="000000" w:themeColor="text1"/>
-          <w:sz w:val="24"/>
-          <w:szCs w:val="24"/>
-        </w:rPr>
-        <w:t>/</w:t>
-      </w:r>
-      <w:r>
-        <w:rPr>
-          <w:rFonts w:ascii="Inter" w:eastAsia="Inter" w:hAnsi="Inter" w:cs="Inter"/>
-          <w:color w:val="000000" w:themeColor="text1"/>
-          <w:sz w:val="24"/>
-          <w:szCs w:val="24"/>
-          <w:lang w:val="en-US"/>
-        </w:rPr>
-        <w:t xml:space="preserve">{{ </w:t>
-      </w:r>
-      <w:proofErr w:type="spellStart"/>
-      <w:r>
-        <w:rPr>
-          <w:rFonts w:ascii="Inter" w:eastAsia="Inter" w:hAnsi="Inter" w:cs="Inter"/>
-          <w:color w:val="000000" w:themeColor="text1"/>
-          <w:sz w:val="24"/>
-          <w:szCs w:val="24"/>
-          <w:lang w:val="en-US"/>
-        </w:rPr>
-        <w:t>yyyy</w:t>
-      </w:r>
-      <w:proofErr w:type="spellEnd"/>
-      <w:proofErr w:type="gramEnd"/>
-      <w:r>
-        <w:rPr>
-          <w:rFonts w:ascii="Inter" w:eastAsia="Inter" w:hAnsi="Inter" w:cs="Inter"/>
-          <w:color w:val="000000" w:themeColor="text1"/>
-          <w:sz w:val="24"/>
-          <w:szCs w:val="24"/>
-          <w:lang w:val="en-US"/>
-        </w:rPr>
-        <w:t xml:space="preserve"> }}</w:t>
-      </w:r>
-      <w:r>
-        <w:rPr>
-          <w:rFonts w:ascii="Inter" w:eastAsia="Inter" w:hAnsi="Inter" w:cs="Inter"/>
-          <w:color w:val="000000" w:themeColor="text1"/>
-          <w:sz w:val="24"/>
-          <w:szCs w:val="24"/>
-        </w:rPr>
-        <w:t>/HĐCG</w:t>
-      </w:r>
-      <w:proofErr w:type="gramStart"/>
-      <w:r>
-        <w:rPr>
-          <w:rFonts w:ascii="Inter" w:eastAsia="Inter" w:hAnsi="Inter" w:cs="Inter"/>
-          <w:color w:val="000000" w:themeColor="text1"/>
-          <w:sz w:val="24"/>
-          <w:szCs w:val="24"/>
-        </w:rPr>
         <w:t>-</w:t>
       </w:r>
       <w:r>
@@ -3842,51 +3208,7 @@
           <w:szCs w:val="24"/>
           <w:lang w:val="en-US"/>
         </w:rPr>
-        <w:t xml:space="preserve">{{ </w:t>
-      </w:r>
-      <w:proofErr w:type="spellStart"/>
-      <w:r>
-        <w:rPr>
-          <w:rFonts w:ascii="Inter" w:eastAsia="Inter" w:hAnsi="Inter" w:cs="Inter"/>
-          <w:color w:val="000000" w:themeColor="text1"/>
-          <w:sz w:val="24"/>
-          <w:szCs w:val="24"/>
-          <w:lang w:val="en-US"/>
-        </w:rPr>
-        <w:t>abbreviated</w:t>
-      </w:r>
-      <w:proofErr w:type="gramEnd"/>
-      <w:r>
-        <w:rPr>
-          <w:rFonts w:ascii="Inter" w:eastAsia="Inter" w:hAnsi="Inter" w:cs="Inter"/>
-          <w:color w:val="000000" w:themeColor="text1"/>
-          <w:sz w:val="24"/>
-          <w:szCs w:val="24"/>
-          <w:lang w:val="en-US"/>
-        </w:rPr>
-        <w:t>_</w:t>
-      </w:r>
-      <w:proofErr w:type="gramStart"/>
-      <w:r>
-        <w:rPr>
-          <w:rFonts w:ascii="Inter" w:eastAsia="Inter" w:hAnsi="Inter" w:cs="Inter"/>
-          <w:color w:val="000000" w:themeColor="text1"/>
-          <w:sz w:val="24"/>
-          <w:szCs w:val="24"/>
-          <w:lang w:val="en-US"/>
-        </w:rPr>
-        <w:t>project</w:t>
-      </w:r>
-      <w:proofErr w:type="spellEnd"/>
-      <w:r>
-        <w:rPr>
-          <w:rFonts w:ascii="Inter" w:eastAsia="Inter" w:hAnsi="Inter" w:cs="Inter"/>
-          <w:color w:val="000000" w:themeColor="text1"/>
-          <w:sz w:val="24"/>
-          <w:szCs w:val="24"/>
-          <w:lang w:val="en-US"/>
-        </w:rPr>
-        <w:t xml:space="preserve"> }}{{ </w:t>
+        <w:t xml:space="preserve">{{ abbreviated_project }}{{ </w:t>
       </w:r>
       <w:proofErr w:type="spellStart"/>
       <w:r>

</xml_diff>

<commit_message>
update text in orrderr name
</commit_message>
<xml_diff>
--- a/template/Template_BBNT.docx
+++ b/template/Template_BBNT.docx
@@ -15,8 +15,8 @@
         <w:tblLook w:val="0400" w:firstRow="0" w:lastRow="0" w:firstColumn="0" w:lastColumn="0" w:noHBand="0" w:noVBand="1"/>
       </w:tblPr>
       <w:tblGrid>
-        <w:gridCol w:w="5280"/>
-        <w:gridCol w:w="4224"/>
+        <w:gridCol w:w="4121"/>
+        <w:gridCol w:w="5383"/>
       </w:tblGrid>
       <w:tr>
         <w:trPr>
@@ -46,6 +46,7 @@
                 <w:color w:val="000000" w:themeColor="text1"/>
                 <w:sz w:val="24"/>
                 <w:szCs w:val="24"/>
+                <w:lang w:val="en-US"/>
               </w:rPr>
             </w:pPr>
             <w:r>
@@ -65,63 +66,27 @@
                 <w:szCs w:val="24"/>
                 <w:lang w:val="en-US"/>
               </w:rPr>
-              <w:t xml:space="preserve">{{ order_id }}</w:t>
-            </w:r>
-            <w:r>
-              <w:rPr>
-                <w:rFonts w:ascii="Inter" w:eastAsia="Inter" w:hAnsi="Inter" w:cs="Inter"/>
-                <w:color w:val="000000" w:themeColor="text1"/>
-                <w:sz w:val="24"/>
-                <w:szCs w:val="24"/>
-              </w:rPr>
-              <w:t>/</w:t>
-            </w:r>
-            <w:r>
-              <w:rPr>
-                <w:rFonts w:ascii="Inter" w:eastAsia="Inter" w:hAnsi="Inter" w:cs="Inter"/>
-                <w:color w:val="000000" w:themeColor="text1"/>
-                <w:sz w:val="24"/>
-                <w:szCs w:val="24"/>
-                <w:lang w:val="en-US"/>
-              </w:rPr>
-              <w:t xml:space="preserve">{{ yyyy }}</w:t>
-            </w:r>
-            <w:r>
-              <w:rPr>
-                <w:rFonts w:ascii="Inter" w:eastAsia="Inter" w:hAnsi="Inter" w:cs="Inter"/>
-                <w:color w:val="000000" w:themeColor="text1"/>
-                <w:sz w:val="24"/>
-                <w:szCs w:val="24"/>
-              </w:rPr>
-              <w:t>/</w:t>
-            </w:r>
-            <w:r>
-              <w:rPr>
-                <w:rFonts w:ascii="Inter" w:eastAsia="Inter" w:hAnsi="Inter" w:cs="Inter"/>
-                <w:color w:val="000000" w:themeColor="text1"/>
-                <w:sz w:val="24"/>
-                <w:szCs w:val="24"/>
-              </w:rPr>
-              <w:t>BBNT</w:t>
-            </w:r>
-            <w:r>
-              <w:rPr>
-                <w:rFonts w:ascii="Inter" w:eastAsia="Inter" w:hAnsi="Inter" w:cs="Inter"/>
-                <w:color w:val="000000" w:themeColor="text1"/>
-                <w:sz w:val="24"/>
-                <w:szCs w:val="24"/>
-              </w:rPr>
-              <w:t>-</w:t>
-            </w:r>
-            <w:r>
-              <w:rPr>
-                <w:rFonts w:ascii="Inter" w:eastAsia="Inter" w:hAnsi="Inter" w:cs="Inter"/>
-                <w:color w:val="000000" w:themeColor="text1"/>
-                <w:sz w:val="24"/>
-                <w:szCs w:val="24"/>
-                <w:lang w:val="en-US"/>
-              </w:rPr>
-              <w:t xml:space="preserve">{{ abbreviated_project }}{{ additional_information }}</w:t>
+              <w:t xml:space="preserve">{{ </w:t>
+            </w:r>
+            <w:r>
+              <w:rPr>
+                <w:rFonts w:ascii="Inter" w:eastAsia="Inter" w:hAnsi="Inter" w:cs="Inter"/>
+                <w:color w:val="000000" w:themeColor="text1"/>
+                <w:sz w:val="24"/>
+                <w:szCs w:val="24"/>
+                <w:lang w:val="en-US"/>
+              </w:rPr>
+              <w:t>acceptance</w:t>
+            </w:r>
+            <w:r>
+              <w:rPr>
+                <w:rFonts w:ascii="Inter" w:eastAsia="Inter" w:hAnsi="Inter" w:cs="Inter"/>
+                <w:color w:val="000000" w:themeColor="text1"/>
+                <w:sz w:val="24"/>
+                <w:szCs w:val="24"/>
+                <w:lang w:val="en-US"/>
+              </w:rPr>
+              <w:t xml:space="preserve"> }}</w:t>
             </w:r>
           </w:p>
         </w:tc>
@@ -162,7 +127,7 @@
                 <w:szCs w:val="24"/>
                 <w:lang w:val="en-US"/>
               </w:rPr>
-              <w:t xml:space="preserve">{{ dd }}</w:t>
+              <w:t>{{ dd }}</w:t>
             </w:r>
             <w:r>
               <w:rPr>
@@ -181,7 +146,7 @@
                 <w:szCs w:val="24"/>
                 <w:lang w:val="en-US"/>
               </w:rPr>
-              <w:t xml:space="preserve">{{ mm }}</w:t>
+              <w:t>{{ mm }}</w:t>
             </w:r>
             <w:r>
               <w:rPr>
@@ -200,7 +165,7 @@
                 <w:szCs w:val="24"/>
                 <w:lang w:val="en-US"/>
               </w:rPr>
-              <w:t xml:space="preserve">{{ yyyy }}</w:t>
+              <w:t>{{ yyyy }}</w:t>
             </w:r>
             <w:r>
               <w:rPr>
@@ -408,7 +373,7 @@
           <w:szCs w:val="24"/>
           <w:lang w:val="en-US"/>
         </w:rPr>
-        <w:t xml:space="preserve">{{ dd }}</w:t>
+        <w:t>{{ dd }}</w:t>
       </w:r>
       <w:r>
         <w:rPr>
@@ -431,7 +396,7 @@
           <w:szCs w:val="24"/>
           <w:lang w:val="en-US"/>
         </w:rPr>
-        <w:t xml:space="preserve">{{ mm }}</w:t>
+        <w:t>{{ mm }}</w:t>
       </w:r>
       <w:r>
         <w:rPr>
@@ -454,7 +419,7 @@
           <w:szCs w:val="24"/>
           <w:lang w:val="en-US"/>
         </w:rPr>
-        <w:t xml:space="preserve">{{ yyyy }}</w:t>
+        <w:t>{{ yyyy }}</w:t>
       </w:r>
       <w:r>
         <w:rPr>
@@ -751,7 +716,7 @@
           <w:szCs w:val="24"/>
           <w:lang w:val="en-US"/>
         </w:rPr>
-        <w:t xml:space="preserve">{{ pronoun }}</w:t>
+        <w:t>{{ pronoun }}</w:t>
       </w:r>
       <w:r>
         <w:rPr>
@@ -777,7 +742,7 @@
           <w:szCs w:val="24"/>
           <w:lang w:val="en-US"/>
         </w:rPr>
-        <w:t xml:space="preserve">{{ expert_name }}</w:t>
+        <w:t>{{ expert_name }}</w:t>
       </w:r>
     </w:p>
     <w:p>
@@ -815,7 +780,7 @@
           <w:szCs w:val="24"/>
           <w:lang w:val="en-US"/>
         </w:rPr>
-        <w:t xml:space="preserve">{{ nationality }}</w:t>
+        <w:t>{{ nationality }}</w:t>
       </w:r>
     </w:p>
     <w:p>
@@ -853,7 +818,7 @@
           <w:szCs w:val="24"/>
           <w:lang w:val="en-US"/>
         </w:rPr>
-        <w:t xml:space="preserve">{{ address }}</w:t>
+        <w:t>{{ address }}</w:t>
       </w:r>
     </w:p>
     <w:p>
@@ -891,7 +856,7 @@
           <w:szCs w:val="24"/>
           <w:lang w:val="en-US"/>
         </w:rPr>
-        <w:t xml:space="preserve">{{ id_number }}</w:t>
+        <w:t>{{ id_number }}</w:t>
       </w:r>
       <w:r>
         <w:tab/>
@@ -915,7 +880,7 @@
           <w:szCs w:val="24"/>
           <w:lang w:val="en-US"/>
         </w:rPr>
-        <w:t xml:space="preserve">{{ issued_date }}</w:t>
+        <w:t>{{ issued_date }}</w:t>
       </w:r>
       <w:r>
         <w:rPr>
@@ -963,7 +928,7 @@
           <w:szCs w:val="24"/>
           <w:lang w:val="en-US"/>
         </w:rPr>
-        <w:t xml:space="preserve">{{ issued_place }}</w:t>
+        <w:t>{{ issued_place }}</w:t>
       </w:r>
       <w:r>
         <w:rPr>
@@ -1011,7 +976,7 @@
           <w:szCs w:val="24"/>
           <w:lang w:val="en-US"/>
         </w:rPr>
-        <w:t xml:space="preserve">{{ email_address }}</w:t>
+        <w:t>{{ email_address }}</w:t>
       </w:r>
       <w:r>
         <w:rPr>
@@ -1049,7 +1014,7 @@
           <w:szCs w:val="24"/>
           <w:lang w:val="en-US"/>
         </w:rPr>
-        <w:t xml:space="preserve">{{ phone }}</w:t>
+        <w:t>{{ phone }}</w:t>
       </w:r>
     </w:p>
     <w:p>
@@ -1087,7 +1052,7 @@
           <w:szCs w:val="24"/>
           <w:lang w:val="en-US"/>
         </w:rPr>
-        <w:t xml:space="preserve">{{ bank_account }}</w:t>
+        <w:t>{{ bank_account }}</w:t>
       </w:r>
       <w:r>
         <w:rPr>
@@ -1108,7 +1073,7 @@
           <w:szCs w:val="24"/>
           <w:lang w:val="en-US"/>
         </w:rPr>
-        <w:t xml:space="preserve">{{ bank_name }}</w:t>
+        <w:t>{{ bank_name }}</w:t>
       </w:r>
     </w:p>
     <w:p>
@@ -1140,45 +1105,7 @@
           <w:szCs w:val="24"/>
           <w:lang w:val="en-US"/>
         </w:rPr>
-        <w:t xml:space="preserve">{{ order }}</w:t>
-      </w:r>
-      <w:r>
-        <w:rPr>
-          <w:rFonts w:ascii="Inter" w:eastAsia="Inter" w:hAnsi="Inter" w:cs="Inter"/>
-          <w:color w:val="000000" w:themeColor="text1"/>
-          <w:sz w:val="24"/>
-          <w:szCs w:val="24"/>
-        </w:rPr>
-        <w:t>/</w:t>
-      </w:r>
-      <w:r>
-        <w:rPr>
-          <w:rFonts w:ascii="Inter" w:eastAsia="Inter" w:hAnsi="Inter" w:cs="Inter"/>
-          <w:color w:val="000000" w:themeColor="text1"/>
-          <w:sz w:val="24"/>
-          <w:szCs w:val="24"/>
-          <w:lang w:val="en-US"/>
-        </w:rPr>
-        <w:t xml:space="preserve">{{ yyyy }}</w:t>
-      </w:r>
-      <w:r>
-        <w:rPr>
-          <w:rFonts w:ascii="Inter" w:eastAsia="Inter" w:hAnsi="Inter" w:cs="Inter"/>
-          <w:color w:val="000000" w:themeColor="text1"/>
-          <w:sz w:val="24"/>
-          <w:szCs w:val="24"/>
-        </w:rPr>
-        <w:t>/HĐCG-</w:t>
-      </w:r>
-      <w:r>
-        <w:rPr>
-          <w:rFonts w:ascii="Inter" w:eastAsia="Inter" w:hAnsi="Inter" w:cs="Inter"/>
-          <w:color w:val="000000" w:themeColor="text1"/>
-          <w:sz w:val="24"/>
-          <w:szCs w:val="24"/>
-          <w:lang w:val="en-US"/>
-        </w:rPr>
-        <w:t xml:space="preserve">{{ abbreviated_project }}{{ additional_information }}</w:t>
+        <w:t>{{ order }}</w:t>
       </w:r>
       <w:r>
         <w:rPr>
@@ -2043,7 +1970,18 @@
                 <w:sz w:val="24"/>
                 <w:szCs w:val="24"/>
               </w:rPr>
-              <w:t>{% endfor %}</w:t>
+              <w:t>{% endf</w:t>
+            </w:r>
+            <w:r>
+              <w:rPr>
+                <w:rFonts w:ascii="Inter" w:eastAsia="Inter" w:hAnsi="Inter" w:cs="Inter"/>
+                <w:i/>
+                <w:iCs/>
+                <w:sz w:val="24"/>
+                <w:szCs w:val="24"/>
+              </w:rPr>
+              <w:lastRenderedPageBreak/>
+              <w:t>or %}</w:t>
             </w:r>
           </w:p>
         </w:tc>
@@ -3160,7 +3098,51 @@
           <w:szCs w:val="24"/>
           <w:lang w:val="en-US"/>
         </w:rPr>
-        <w:t xml:space="preserve">{{ order_id }}</w:t>
+        <w:t xml:space="preserve">{{ </w:t>
+      </w:r>
+      <w:proofErr w:type="spellStart"/>
+      <w:r>
+        <w:rPr>
+          <w:rFonts w:ascii="Inter" w:eastAsia="Inter" w:hAnsi="Inter" w:cs="Inter"/>
+          <w:color w:val="000000" w:themeColor="text1"/>
+          <w:sz w:val="24"/>
+          <w:szCs w:val="24"/>
+          <w:lang w:val="en-US"/>
+        </w:rPr>
+        <w:t>order</w:t>
+      </w:r>
+      <w:proofErr w:type="gramEnd"/>
+      <w:r>
+        <w:rPr>
+          <w:rFonts w:ascii="Inter" w:eastAsia="Inter" w:hAnsi="Inter" w:cs="Inter"/>
+          <w:color w:val="000000" w:themeColor="text1"/>
+          <w:sz w:val="24"/>
+          <w:szCs w:val="24"/>
+          <w:lang w:val="en-US"/>
+        </w:rPr>
+        <w:t>_</w:t>
+      </w:r>
+      <w:proofErr w:type="gramStart"/>
+      <w:r>
+        <w:rPr>
+          <w:rFonts w:ascii="Inter" w:eastAsia="Inter" w:hAnsi="Inter" w:cs="Inter"/>
+          <w:color w:val="000000" w:themeColor="text1"/>
+          <w:sz w:val="24"/>
+          <w:szCs w:val="24"/>
+          <w:lang w:val="en-US"/>
+        </w:rPr>
+        <w:t>id</w:t>
+      </w:r>
+      <w:proofErr w:type="spellEnd"/>
+      <w:r>
+        <w:rPr>
+          <w:rFonts w:ascii="Inter" w:eastAsia="Inter" w:hAnsi="Inter" w:cs="Inter"/>
+          <w:color w:val="000000" w:themeColor="text1"/>
+          <w:sz w:val="24"/>
+          <w:szCs w:val="24"/>
+          <w:lang w:val="en-US"/>
+        </w:rPr>
+        <w:t xml:space="preserve"> }}</w:t>
       </w:r>
       <w:r>
         <w:rPr>
@@ -3179,7 +3161,18 @@
           <w:szCs w:val="24"/>
           <w:lang w:val="en-US"/>
         </w:rPr>
-        <w:t xml:space="preserve">{{ yyyy }}</w:t>
+        <w:t>{{ yyyy</w:t>
+      </w:r>
+      <w:proofErr w:type="gramEnd"/>
+      <w:r>
+        <w:rPr>
+          <w:rFonts w:ascii="Inter" w:eastAsia="Inter" w:hAnsi="Inter" w:cs="Inter"/>
+          <w:color w:val="000000" w:themeColor="text1"/>
+          <w:sz w:val="24"/>
+          <w:szCs w:val="24"/>
+          <w:lang w:val="en-US"/>
+        </w:rPr>
+        <w:t xml:space="preserve"> }}</w:t>
       </w:r>
       <w:r>
         <w:rPr>
@@ -3208,7 +3201,51 @@
           <w:szCs w:val="24"/>
           <w:lang w:val="en-US"/>
         </w:rPr>
-        <w:t xml:space="preserve">{{ abbreviated_project }}{{ </w:t>
+        <w:t xml:space="preserve">{{ </w:t>
+      </w:r>
+      <w:proofErr w:type="spellStart"/>
+      <w:r>
+        <w:rPr>
+          <w:rFonts w:ascii="Inter" w:eastAsia="Inter" w:hAnsi="Inter" w:cs="Inter"/>
+          <w:color w:val="000000" w:themeColor="text1"/>
+          <w:sz w:val="24"/>
+          <w:szCs w:val="24"/>
+          <w:lang w:val="en-US"/>
+        </w:rPr>
+        <w:t>abbreviated</w:t>
+      </w:r>
+      <w:proofErr w:type="gramEnd"/>
+      <w:r>
+        <w:rPr>
+          <w:rFonts w:ascii="Inter" w:eastAsia="Inter" w:hAnsi="Inter" w:cs="Inter"/>
+          <w:color w:val="000000" w:themeColor="text1"/>
+          <w:sz w:val="24"/>
+          <w:szCs w:val="24"/>
+          <w:lang w:val="en-US"/>
+        </w:rPr>
+        <w:t>_</w:t>
+      </w:r>
+      <w:proofErr w:type="gramStart"/>
+      <w:r>
+        <w:rPr>
+          <w:rFonts w:ascii="Inter" w:eastAsia="Inter" w:hAnsi="Inter" w:cs="Inter"/>
+          <w:color w:val="000000" w:themeColor="text1"/>
+          <w:sz w:val="24"/>
+          <w:szCs w:val="24"/>
+          <w:lang w:val="en-US"/>
+        </w:rPr>
+        <w:t>project</w:t>
+      </w:r>
+      <w:proofErr w:type="spellEnd"/>
+      <w:r>
+        <w:rPr>
+          <w:rFonts w:ascii="Inter" w:eastAsia="Inter" w:hAnsi="Inter" w:cs="Inter"/>
+          <w:color w:val="000000" w:themeColor="text1"/>
+          <w:sz w:val="24"/>
+          <w:szCs w:val="24"/>
+          <w:lang w:val="en-US"/>
+        </w:rPr>
+        <w:t xml:space="preserve"> }}{{ </w:t>
       </w:r>
       <w:proofErr w:type="spellStart"/>
       <w:r>
@@ -4075,7 +4112,7 @@
             </wp:anchor>
           </w:drawing>
         </mc:Choice>
-        <mc:Fallback xmlns:a="http://schemas.openxmlformats.org/drawingml/2006/main" xmlns:pic="http://schemas.openxmlformats.org/drawingml/2006/picture" xmlns:a14="http://schemas.microsoft.com/office/drawing/2010/main">
+        <mc:Fallback xmlns:a14="http://schemas.microsoft.com/office/drawing/2010/main" xmlns:pic="http://schemas.openxmlformats.org/drawingml/2006/picture" xmlns:a="http://schemas.openxmlformats.org/drawingml/2006/main">
           <w:pict w14:anchorId="42E1B52A">
             <v:line id="Straight Connector 3" style="position:absolute;z-index:251659264;visibility:visible;mso-wrap-style:square;mso-width-percent:0;mso-height-percent:0;mso-wrap-distance-left:9pt;mso-wrap-distance-top:-3e-5mm;mso-wrap-distance-right:9pt;mso-wrap-distance-bottom:-3e-5mm;mso-position-horizontal:absolute;mso-position-horizontal-relative:margin;mso-position-vertical:absolute;mso-position-vertical-relative:text;mso-width-percent:0;mso-height-percent:0;mso-width-relative:margin;mso-height-relative:margin" o:spid="_x0000_s1026" strokecolor="#0b4133" strokeweight="1pt" from="-2.1pt,2.6pt" to="471.3pt,2.6pt" w14:anchorId="27534703" o:gfxdata="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">
               <v:stroke joinstyle="miter"/>

</xml_diff>